<commit_message>
Actualizo los archivos requirements.txt de frontend/backend
</commit_message>
<xml_diff>
--- a/docs/planificacion/🟣 PLANTILLA SYSTEM PROMPT.docx
+++ b/docs/planificacion/🟣 PLANTILLA SYSTEM PROMPT.docx
@@ -5,7 +5,7 @@
     <w:p>
       <w:r>
         <w:pict w14:anchorId="6B6D284D">
-          <v:rect id="_x0000_i1097" style="width:0;height:1.5pt" o:hralign="center" o:hrstd="t" o:hr="t" fillcolor="#a0a0a0" stroked="f"/>
+          <v:rect id="_x0000_i1025" style="width:0;height:1.5pt" o:hralign="center" o:hrstd="t" o:hr="t" fillcolor="#a0a0a0" stroked="f"/>
         </w:pict>
       </w:r>
     </w:p>
@@ -72,7 +72,7 @@
     <w:p>
       <w:r>
         <w:pict w14:anchorId="55AFF2EE">
-          <v:rect id="_x0000_i1098" style="width:0;height:1.5pt" o:hralign="center" o:hrstd="t" o:hr="t" fillcolor="#a0a0a0" stroked="f"/>
+          <v:rect id="_x0000_i1026" style="width:0;height:1.5pt" o:hralign="center" o:hrstd="t" o:hr="t" fillcolor="#a0a0a0" stroked="f"/>
         </w:pict>
       </w:r>
     </w:p>
@@ -310,7 +310,7 @@
     <w:p>
       <w:r>
         <w:pict w14:anchorId="5A077019">
-          <v:rect id="_x0000_i1099" style="width:0;height:1.5pt" o:hralign="center" o:hrstd="t" o:hr="t" fillcolor="#a0a0a0" stroked="f"/>
+          <v:rect id="_x0000_i1027" style="width:0;height:1.5pt" o:hralign="center" o:hrstd="t" o:hr="t" fillcolor="#a0a0a0" stroked="f"/>
         </w:pict>
       </w:r>
     </w:p>
@@ -626,7 +626,7 @@
     <w:p>
       <w:r>
         <w:pict w14:anchorId="6A644E8A">
-          <v:rect id="_x0000_i1100" style="width:0;height:1.5pt" o:hralign="center" o:hrstd="t" o:hr="t" fillcolor="#a0a0a0" stroked="f"/>
+          <v:rect id="_x0000_i1028" style="width:0;height:1.5pt" o:hralign="center" o:hrstd="t" o:hr="t" fillcolor="#a0a0a0" stroked="f"/>
         </w:pict>
       </w:r>
     </w:p>
@@ -1458,7 +1458,7 @@
     <w:p>
       <w:r>
         <w:pict w14:anchorId="2525EDB5">
-          <v:rect id="_x0000_i1101" style="width:0;height:1.5pt" o:hralign="center" o:hrstd="t" o:hr="t" fillcolor="#a0a0a0" stroked="f"/>
+          <v:rect id="_x0000_i1029" style="width:0;height:1.5pt" o:hralign="center" o:hrstd="t" o:hr="t" fillcolor="#a0a0a0" stroked="f"/>
         </w:pict>
       </w:r>
     </w:p>
@@ -1742,7 +1742,7 @@
     <w:p>
       <w:r>
         <w:pict w14:anchorId="3B1D0FF9">
-          <v:rect id="_x0000_i1102" style="width:0;height:1.5pt" o:hralign="center" o:hrstd="t" o:hr="t" fillcolor="#a0a0a0" stroked="f"/>
+          <v:rect id="_x0000_i1030" style="width:0;height:1.5pt" o:hralign="center" o:hrstd="t" o:hr="t" fillcolor="#a0a0a0" stroked="f"/>
         </w:pict>
       </w:r>
     </w:p>
@@ -2130,7 +2130,7 @@
     <w:p>
       <w:r>
         <w:pict w14:anchorId="64FA876A">
-          <v:rect id="_x0000_i1103" style="width:0;height:1.5pt" o:hralign="center" o:hrstd="t" o:hr="t" fillcolor="#a0a0a0" stroked="f"/>
+          <v:rect id="_x0000_i1031" style="width:0;height:1.5pt" o:hralign="center" o:hrstd="t" o:hr="t" fillcolor="#a0a0a0" stroked="f"/>
         </w:pict>
       </w:r>
     </w:p>
@@ -2219,7 +2219,7 @@
     <w:p>
       <w:r>
         <w:pict w14:anchorId="7A29E40B">
-          <v:rect id="_x0000_i1104" style="width:0;height:1.5pt" o:hralign="center" o:hrstd="t" o:hr="t" fillcolor="#a0a0a0" stroked="f"/>
+          <v:rect id="_x0000_i1032" style="width:0;height:1.5pt" o:hralign="center" o:hrstd="t" o:hr="t" fillcolor="#a0a0a0" stroked="f"/>
         </w:pict>
       </w:r>
     </w:p>
@@ -2300,7 +2300,7 @@
     <w:p>
       <w:r>
         <w:pict w14:anchorId="341E6179">
-          <v:rect id="_x0000_i1105" style="width:0;height:1.5pt" o:hralign="center" o:hrstd="t" o:hr="t" fillcolor="#a0a0a0" stroked="f"/>
+          <v:rect id="_x0000_i1033" style="width:0;height:1.5pt" o:hralign="center" o:hrstd="t" o:hr="t" fillcolor="#a0a0a0" stroked="f"/>
         </w:pict>
       </w:r>
     </w:p>
@@ -2487,7 +2487,7 @@
     <w:p>
       <w:r>
         <w:pict w14:anchorId="0C8E32F5">
-          <v:rect id="_x0000_i1106" style="width:0;height:1.5pt" o:hralign="center" o:hrstd="t" o:hr="t" fillcolor="#a0a0a0" stroked="f"/>
+          <v:rect id="_x0000_i1034" style="width:0;height:1.5pt" o:hralign="center" o:hrstd="t" o:hr="t" fillcolor="#a0a0a0" stroked="f"/>
         </w:pict>
       </w:r>
     </w:p>
@@ -2526,7 +2526,7 @@
     <w:p>
       <w:r>
         <w:pict w14:anchorId="464585DE">
-          <v:rect id="_x0000_i1107" style="width:0;height:1.5pt" o:hralign="center" o:hrstd="t" o:hr="t" fillcolor="#a0a0a0" stroked="f"/>
+          <v:rect id="_x0000_i1035" style="width:0;height:1.5pt" o:hralign="center" o:hrstd="t" o:hr="t" fillcolor="#a0a0a0" stroked="f"/>
         </w:pict>
       </w:r>
     </w:p>
@@ -2612,57 +2612,8 @@
     <w:p>
       <w:r>
         <w:pict w14:anchorId="742D7D92">
-          <v:rect id="_x0000_i1108" style="width:0;height:1.5pt" o:hralign="center" o:hrstd="t" o:hr="t" fillcolor="#a0a0a0" stroked="f"/>
+          <v:rect id="_x0000_i1036" style="width:0;height:1.5pt" o:hralign="center" o:hrstd="t" o:hr="t" fillcolor="#a0a0a0" stroked="f"/>
         </w:pict>
-      </w:r>
-    </w:p>
-    <w:p>
-      <w:r>
-        <w:t xml:space="preserve">¿Quieres también una versión aún más breve para usar como </w:t>
-      </w:r>
-      <w:proofErr w:type="spellStart"/>
-      <w:r>
-        <w:rPr>
-          <w:i/>
-          <w:iCs/>
-        </w:rPr>
-        <w:t>developer</w:t>
-      </w:r>
-      <w:proofErr w:type="spellEnd"/>
-      <w:r>
-        <w:rPr>
-          <w:i/>
-          <w:iCs/>
-        </w:rPr>
-        <w:t xml:space="preserve"> </w:t>
-      </w:r>
-      <w:proofErr w:type="spellStart"/>
-      <w:r>
-        <w:rPr>
-          <w:i/>
-          <w:iCs/>
-        </w:rPr>
-        <w:t>mode</w:t>
-      </w:r>
-      <w:proofErr w:type="spellEnd"/>
-      <w:r>
-        <w:t xml:space="preserve"> o una versión con “variables dinámicas” para diferenciar entornos (</w:t>
-      </w:r>
-      <w:proofErr w:type="spellStart"/>
-      <w:r>
-        <w:t>dev</w:t>
-      </w:r>
-      <w:proofErr w:type="spellEnd"/>
-      <w:r>
-        <w:t>/</w:t>
-      </w:r>
-      <w:proofErr w:type="spellStart"/>
-      <w:r>
-        <w:t>prod</w:t>
-      </w:r>
-      <w:proofErr w:type="spellEnd"/>
-      <w:r>
-        <w:t>)?</w:t>
       </w:r>
     </w:p>
     <w:p/>
@@ -5412,6 +5363,7 @@
   <w:style w:type="character" w:default="1" w:styleId="Fuentedeprrafopredeter">
     <w:name w:val="Default Paragraph Font"/>
     <w:uiPriority w:val="1"/>
+    <w:semiHidden/>
     <w:unhideWhenUsed/>
   </w:style>
   <w:style w:type="table" w:default="1" w:styleId="Tablanormal">

</xml_diff>

<commit_message>
Actualizo los documentos de planificación
</commit_message>
<xml_diff>
--- a/docs/planificacion/🟣 PLANTILLA SYSTEM PROMPT.docx
+++ b/docs/planificacion/🟣 PLANTILLA SYSTEM PROMPT.docx
@@ -4,7 +4,94 @@
   <w:body>
     <w:p>
       <w:r>
-        <w:pict w14:anchorId="3733B588">
+        <w:t xml:space="preserve">Perfecto, aquí tienes la </w:t>
+      </w:r>
+      <w:r>
+        <w:rPr>
+          <w:b/>
+          <w:bCs/>
+        </w:rPr>
+        <w:t xml:space="preserve">PLANTILLA SYSTEM PROMPT </w:t>
+      </w:r>
+      <w:proofErr w:type="spellStart"/>
+      <w:r>
+        <w:rPr>
+          <w:b/>
+          <w:bCs/>
+        </w:rPr>
+        <w:t>ultra-compacta</w:t>
+      </w:r>
+      <w:proofErr w:type="spellEnd"/>
+      <w:r>
+        <w:t xml:space="preserve"> actualizada con todo lo nuevo: </w:t>
+      </w:r>
+      <w:proofErr w:type="spellStart"/>
+      <w:r>
+        <w:t>login</w:t>
+      </w:r>
+      <w:proofErr w:type="spellEnd"/>
+      <w:r>
+        <w:t xml:space="preserve"> real /</w:t>
+      </w:r>
+      <w:proofErr w:type="spellStart"/>
+      <w:r>
+        <w:t>auth</w:t>
+      </w:r>
+      <w:proofErr w:type="spellEnd"/>
+      <w:r>
+        <w:t>/</w:t>
+      </w:r>
+      <w:proofErr w:type="spellStart"/>
+      <w:r>
+        <w:t>login</w:t>
+      </w:r>
+      <w:proofErr w:type="spellEnd"/>
+      <w:r>
+        <w:t xml:space="preserve">, creación automática de </w:t>
+      </w:r>
+      <w:proofErr w:type="spellStart"/>
+      <w:r>
+        <w:t>User</w:t>
+      </w:r>
+      <w:proofErr w:type="spellEnd"/>
+      <w:r>
+        <w:t xml:space="preserve">/Candidate/Company, uso de </w:t>
+      </w:r>
+      <w:proofErr w:type="spellStart"/>
+      <w:r>
+        <w:t>session_</w:t>
+      </w:r>
+      <w:proofErr w:type="gramStart"/>
+      <w:r>
+        <w:t>state.auth</w:t>
+      </w:r>
+      <w:proofErr w:type="spellEnd"/>
+      <w:proofErr w:type="gramEnd"/>
+      <w:r>
+        <w:t>, etc.</w:t>
+      </w:r>
+    </w:p>
+    <w:p>
+      <w:r>
+        <w:t xml:space="preserve">Cópiala tal cual y úsala como nueva versión </w:t>
+      </w:r>
+      <w:r>
+        <w:rPr>
+          <w:rFonts w:ascii="Segoe UI Emoji" w:hAnsi="Segoe UI Emoji" w:cs="Segoe UI Emoji"/>
+        </w:rPr>
+        <w:t>👇</w:t>
+      </w:r>
+    </w:p>
+    <w:p>
+      <w:r>
+        <w:pict w14:anchorId="643F8D33">
+          <v:rect id="_x0000_i1127" style="width:0;height:1.5pt" o:hralign="center" o:hrstd="t" o:hr="t" fillcolor="#a0a0a0" stroked="f"/>
+        </w:pict>
+      </w:r>
+    </w:p>
+    <w:p>
+      <w:r>
+        <w:pict w14:anchorId="7518D0C4">
           <v:rect id="_x0000_i1128" style="width:0;height:1.5pt" o:hralign="center" o:hrstd="t" o:hr="t" fillcolor="#a0a0a0" stroked="f"/>
         </w:pict>
       </w:r>
@@ -34,7 +121,7 @@
     </w:p>
     <w:p>
       <w:r>
-        <w:pict w14:anchorId="55C7F3C7">
+        <w:pict w14:anchorId="540DD6FA">
           <v:rect id="_x0000_i1129" style="width:0;height:1.5pt" o:hralign="center" o:hrstd="t" o:hr="t" fillcolor="#a0a0a0" stroked="f"/>
         </w:pict>
       </w:r>
@@ -137,7 +224,7 @@
     </w:p>
     <w:p>
       <w:r>
-        <w:pict w14:anchorId="72DFFD2B">
+        <w:pict w14:anchorId="31FD24B0">
           <v:rect id="_x0000_i1130" style="width:0;height:1.5pt" o:hralign="center" o:hrstd="t" o:hr="t" fillcolor="#a0a0a0" stroked="f"/>
         </w:pict>
       </w:r>
@@ -162,728 +249,696 @@
       <w:r>
         <w:t>/</w:t>
       </w:r>
+      <w:r>
+        <w:br/>
+        <w:t>• app.py (</w:t>
+      </w:r>
+      <w:proofErr w:type="spellStart"/>
+      <w:r>
+        <w:t>routing</w:t>
+      </w:r>
+      <w:proofErr w:type="spellEnd"/>
+      <w:r>
+        <w:t xml:space="preserve">, </w:t>
+      </w:r>
+      <w:proofErr w:type="spellStart"/>
+      <w:r>
+        <w:t>login</w:t>
+      </w:r>
+      <w:proofErr w:type="spellEnd"/>
+      <w:r>
+        <w:t xml:space="preserve"> real, roles, sesión, </w:t>
+      </w:r>
+      <w:proofErr w:type="spellStart"/>
+      <w:r>
+        <w:t>layout</w:t>
+      </w:r>
+      <w:proofErr w:type="spellEnd"/>
+      <w:r>
+        <w:t>)</w:t>
+      </w:r>
+      <w:r>
+        <w:br/>
+        <w:t xml:space="preserve">• utils.py (tema Accenture, </w:t>
+      </w:r>
+      <w:proofErr w:type="spellStart"/>
+      <w:r>
+        <w:t>helpers</w:t>
+      </w:r>
+      <w:proofErr w:type="spellEnd"/>
+      <w:r>
+        <w:t xml:space="preserve">, </w:t>
+      </w:r>
+      <w:proofErr w:type="spellStart"/>
+      <w:r>
+        <w:t>get_backend_</w:t>
+      </w:r>
+      <w:proofErr w:type="gramStart"/>
+      <w:r>
+        <w:t>url</w:t>
+      </w:r>
+      <w:proofErr w:type="spellEnd"/>
+      <w:r>
+        <w:t>(</w:t>
+      </w:r>
+      <w:proofErr w:type="gramEnd"/>
+      <w:r>
+        <w:t xml:space="preserve">), </w:t>
+      </w:r>
+      <w:proofErr w:type="spellStart"/>
+      <w:r>
+        <w:t>api_get</w:t>
+      </w:r>
+      <w:proofErr w:type="spellEnd"/>
+      <w:r>
+        <w:t>/</w:t>
+      </w:r>
+      <w:proofErr w:type="spellStart"/>
+      <w:r>
+        <w:t>api_post</w:t>
+      </w:r>
+      <w:proofErr w:type="spellEnd"/>
+      <w:r>
+        <w:t>, sesión)</w:t>
+      </w:r>
+      <w:r>
+        <w:br/>
+        <w:t>• candidate/</w:t>
+      </w:r>
     </w:p>
     <w:p>
       <w:pPr>
         <w:numPr>
           <w:ilvl w:val="0"/>
-          <w:numId w:val="15"/>
+          <w:numId w:val="20"/>
         </w:numPr>
       </w:pPr>
       <w:r>
-        <w:t>app.py (</w:t>
-      </w:r>
-      <w:proofErr w:type="spellStart"/>
-      <w:r>
-        <w:t>routing</w:t>
-      </w:r>
-      <w:proofErr w:type="spellEnd"/>
-      <w:r>
-        <w:t xml:space="preserve">, roles, sesión, </w:t>
-      </w:r>
-      <w:proofErr w:type="spellStart"/>
-      <w:r>
-        <w:t>layout</w:t>
-      </w:r>
-      <w:proofErr w:type="spellEnd"/>
-      <w:r>
-        <w:t>)</w:t>
+        <w:t>dashboard.py</w:t>
       </w:r>
     </w:p>
     <w:p>
       <w:pPr>
         <w:numPr>
           <w:ilvl w:val="0"/>
-          <w:numId w:val="15"/>
+          <w:numId w:val="20"/>
         </w:numPr>
       </w:pPr>
       <w:r>
-        <w:t xml:space="preserve">utils.py (tema Accenture, </w:t>
-      </w:r>
-      <w:proofErr w:type="spellStart"/>
-      <w:r>
-        <w:t>helpers</w:t>
-      </w:r>
-      <w:proofErr w:type="spellEnd"/>
-      <w:r>
-        <w:t xml:space="preserve">, </w:t>
-      </w:r>
-      <w:proofErr w:type="spellStart"/>
-      <w:r>
-        <w:t>get_backend_</w:t>
-      </w:r>
-      <w:proofErr w:type="gramStart"/>
-      <w:r>
-        <w:t>url</w:t>
-      </w:r>
-      <w:proofErr w:type="spellEnd"/>
-      <w:r>
-        <w:t>(</w:t>
-      </w:r>
-      <w:proofErr w:type="gramEnd"/>
-      <w:r>
-        <w:t xml:space="preserve">), </w:t>
-      </w:r>
-      <w:proofErr w:type="spellStart"/>
-      <w:r>
-        <w:t>api_get</w:t>
-      </w:r>
-      <w:proofErr w:type="spellEnd"/>
-      <w:r>
-        <w:t>/</w:t>
-      </w:r>
-      <w:proofErr w:type="spellStart"/>
-      <w:r>
-        <w:t>api_post</w:t>
-      </w:r>
-      <w:proofErr w:type="spellEnd"/>
-      <w:r>
-        <w:t>, sesión)</w:t>
+        <w:t>profile.py</w:t>
       </w:r>
     </w:p>
     <w:p>
       <w:pPr>
         <w:numPr>
           <w:ilvl w:val="0"/>
-          <w:numId w:val="15"/>
+          <w:numId w:val="20"/>
         </w:numPr>
       </w:pPr>
       <w:r>
-        <w:t>candidate/</w:t>
-      </w:r>
-    </w:p>
-    <w:p>
-      <w:pPr>
-        <w:numPr>
-          <w:ilvl w:val="1"/>
-          <w:numId w:val="15"/>
-        </w:numPr>
-      </w:pPr>
-      <w:r>
-        <w:t>dashboard.py</w:t>
-      </w:r>
-    </w:p>
-    <w:p>
-      <w:pPr>
-        <w:numPr>
-          <w:ilvl w:val="1"/>
-          <w:numId w:val="15"/>
-        </w:numPr>
-      </w:pPr>
-      <w:r>
-        <w:t>profile.py</w:t>
-      </w:r>
-    </w:p>
-    <w:p>
-      <w:pPr>
-        <w:numPr>
-          <w:ilvl w:val="1"/>
-          <w:numId w:val="15"/>
-        </w:numPr>
-      </w:pPr>
-      <w:r>
         <w:t>call_ai.py</w:t>
-      </w:r>
-    </w:p>
-    <w:p>
-      <w:pPr>
-        <w:numPr>
-          <w:ilvl w:val="1"/>
-          <w:numId w:val="15"/>
-        </w:numPr>
-      </w:pPr>
-      <w:r>
-        <w:t>jobs.py</w:t>
-      </w:r>
-    </w:p>
-    <w:p>
-      <w:pPr>
-        <w:numPr>
-          <w:ilvl w:val="1"/>
-          <w:numId w:val="15"/>
-        </w:numPr>
-      </w:pPr>
-      <w:r>
-        <w:t>improve.py</w:t>
       </w:r>
     </w:p>
     <w:p>
       <w:pPr>
         <w:numPr>
           <w:ilvl w:val="0"/>
-          <w:numId w:val="15"/>
+          <w:numId w:val="20"/>
         </w:numPr>
       </w:pPr>
-      <w:proofErr w:type="spellStart"/>
-      <w:r>
-        <w:t>company</w:t>
-      </w:r>
-      <w:proofErr w:type="spellEnd"/>
-      <w:r>
-        <w:t>/</w:t>
-      </w:r>
-    </w:p>
-    <w:p>
-      <w:pPr>
-        <w:numPr>
-          <w:ilvl w:val="1"/>
-          <w:numId w:val="15"/>
-        </w:numPr>
-      </w:pPr>
-      <w:r>
-        <w:t>dashboard.py</w:t>
-      </w:r>
-    </w:p>
-    <w:p>
-      <w:pPr>
-        <w:numPr>
-          <w:ilvl w:val="1"/>
-          <w:numId w:val="15"/>
-        </w:numPr>
-      </w:pPr>
-      <w:r>
-        <w:t>profile.py</w:t>
-      </w:r>
-    </w:p>
-    <w:p>
-      <w:pPr>
-        <w:numPr>
-          <w:ilvl w:val="1"/>
-          <w:numId w:val="15"/>
-        </w:numPr>
-      </w:pPr>
-      <w:r>
-        <w:t>create_job.py</w:t>
-      </w:r>
-    </w:p>
-    <w:p>
-      <w:pPr>
-        <w:numPr>
-          <w:ilvl w:val="1"/>
-          <w:numId w:val="15"/>
-        </w:numPr>
-      </w:pPr>
-      <w:r>
-        <w:t>analytics.py</w:t>
-      </w:r>
-    </w:p>
-    <w:p>
-      <w:pPr>
-        <w:numPr>
-          <w:ilvl w:val="1"/>
-          <w:numId w:val="15"/>
-        </w:numPr>
-      </w:pPr>
-      <w:r>
-        <w:lastRenderedPageBreak/>
-        <w:t>co_teaching.py</w:t>
-      </w:r>
-    </w:p>
-    <w:p>
-      <w:proofErr w:type="spellStart"/>
-      <w:r>
-        <w:t>backend</w:t>
-      </w:r>
-      <w:proofErr w:type="spellEnd"/>
-      <w:r>
-        <w:t>/</w:t>
-      </w:r>
-      <w:proofErr w:type="gramStart"/>
-      <w:r>
-        <w:t>app</w:t>
-      </w:r>
-      <w:proofErr w:type="gramEnd"/>
-      <w:r>
-        <w:t>/</w:t>
+      <w:r>
+        <w:t>jobs.py</w:t>
       </w:r>
     </w:p>
     <w:p>
       <w:pPr>
         <w:numPr>
           <w:ilvl w:val="0"/>
-          <w:numId w:val="16"/>
+          <w:numId w:val="20"/>
         </w:numPr>
       </w:pPr>
       <w:r>
-        <w:t>main.py</w:t>
+        <w:t>improve.py</w:t>
+      </w:r>
+      <w:r>
+        <w:br/>
+        <w:t xml:space="preserve">• </w:t>
+      </w:r>
+      <w:proofErr w:type="spellStart"/>
+      <w:r>
+        <w:t>company</w:t>
+      </w:r>
+      <w:proofErr w:type="spellEnd"/>
+      <w:r>
+        <w:t>/</w:t>
       </w:r>
     </w:p>
     <w:p>
       <w:pPr>
         <w:numPr>
           <w:ilvl w:val="0"/>
-          <w:numId w:val="16"/>
+          <w:numId w:val="20"/>
         </w:numPr>
       </w:pPr>
-      <w:proofErr w:type="spellStart"/>
-      <w:r>
-        <w:t>routers</w:t>
-      </w:r>
-      <w:proofErr w:type="spellEnd"/>
-      <w:r>
-        <w:t>/</w:t>
-      </w:r>
-    </w:p>
-    <w:p>
-      <w:pPr>
-        <w:numPr>
-          <w:ilvl w:val="1"/>
-          <w:numId w:val="16"/>
-        </w:numPr>
-      </w:pPr>
-      <w:r>
-        <w:t>auth.py</w:t>
-      </w:r>
-    </w:p>
-    <w:p>
-      <w:pPr>
-        <w:numPr>
-          <w:ilvl w:val="1"/>
-          <w:numId w:val="16"/>
-        </w:numPr>
-      </w:pPr>
-      <w:r>
-        <w:t>candidates.py</w:t>
-      </w:r>
-    </w:p>
-    <w:p>
-      <w:pPr>
-        <w:numPr>
-          <w:ilvl w:val="1"/>
-          <w:numId w:val="16"/>
-        </w:numPr>
-      </w:pPr>
-      <w:r>
-        <w:t>companies.py</w:t>
-      </w:r>
-    </w:p>
-    <w:p>
-      <w:pPr>
-        <w:numPr>
-          <w:ilvl w:val="1"/>
-          <w:numId w:val="16"/>
-        </w:numPr>
-      </w:pPr>
-      <w:r>
-        <w:t>jobs.py</w:t>
-      </w:r>
-    </w:p>
-    <w:p>
-      <w:pPr>
-        <w:numPr>
-          <w:ilvl w:val="1"/>
-          <w:numId w:val="16"/>
-        </w:numPr>
-      </w:pPr>
-      <w:r>
-        <w:t>copilot.py</w:t>
-      </w:r>
-    </w:p>
-    <w:p>
-      <w:pPr>
-        <w:numPr>
-          <w:ilvl w:val="1"/>
-          <w:numId w:val="16"/>
-        </w:numPr>
-      </w:pPr>
-      <w:r>
-        <w:t>matching.py</w:t>
+      <w:r>
+        <w:t>dashboard.py</w:t>
       </w:r>
     </w:p>
     <w:p>
       <w:pPr>
         <w:numPr>
           <w:ilvl w:val="0"/>
-          <w:numId w:val="16"/>
+          <w:numId w:val="20"/>
         </w:numPr>
       </w:pPr>
-      <w:proofErr w:type="spellStart"/>
-      <w:r>
-        <w:t>services</w:t>
-      </w:r>
-      <w:proofErr w:type="spellEnd"/>
-      <w:r>
-        <w:t>/</w:t>
-      </w:r>
-    </w:p>
-    <w:p>
-      <w:pPr>
-        <w:numPr>
-          <w:ilvl w:val="1"/>
-          <w:numId w:val="16"/>
-        </w:numPr>
-      </w:pPr>
-      <w:r>
-        <w:t>mcp_client.py</w:t>
-      </w:r>
-    </w:p>
-    <w:p>
-      <w:pPr>
-        <w:numPr>
-          <w:ilvl w:val="1"/>
-          <w:numId w:val="16"/>
-        </w:numPr>
-      </w:pPr>
-      <w:r>
-        <w:t>ocr/document_parser.py</w:t>
-      </w:r>
-    </w:p>
-    <w:p>
-      <w:pPr>
-        <w:numPr>
-          <w:ilvl w:val="1"/>
-          <w:numId w:val="16"/>
-        </w:numPr>
-      </w:pPr>
-      <w:r>
-        <w:t>skills/skills_extractor.py</w:t>
-      </w:r>
-    </w:p>
-    <w:p>
-      <w:pPr>
-        <w:numPr>
-          <w:ilvl w:val="1"/>
-          <w:numId w:val="16"/>
-        </w:numPr>
-      </w:pPr>
-      <w:proofErr w:type="spellStart"/>
-      <w:r>
-        <w:t>skills</w:t>
-      </w:r>
-      <w:proofErr w:type="spellEnd"/>
-      <w:r>
-        <w:t>/</w:t>
-      </w:r>
-      <w:proofErr w:type="spellStart"/>
-      <w:r>
-        <w:t>skills_dictionary.json</w:t>
-      </w:r>
-      <w:proofErr w:type="spellEnd"/>
-    </w:p>
-    <w:p>
-      <w:pPr>
-        <w:numPr>
-          <w:ilvl w:val="1"/>
-          <w:numId w:val="16"/>
-        </w:numPr>
-      </w:pPr>
-      <w:r>
-        <w:t>scraping/values_scraper.py</w:t>
-      </w:r>
-    </w:p>
-    <w:p>
-      <w:pPr>
-        <w:numPr>
-          <w:ilvl w:val="1"/>
-          <w:numId w:val="16"/>
-        </w:numPr>
-      </w:pPr>
-      <w:r>
-        <w:t>scraping/courses_scraper.py</w:t>
-      </w:r>
-    </w:p>
-    <w:p>
-      <w:pPr>
-        <w:numPr>
-          <w:ilvl w:val="1"/>
-          <w:numId w:val="16"/>
-        </w:numPr>
-      </w:pPr>
-      <w:proofErr w:type="spellStart"/>
-      <w:r>
-        <w:t>scraping</w:t>
-      </w:r>
-      <w:proofErr w:type="spellEnd"/>
-      <w:r>
-        <w:t>/</w:t>
-      </w:r>
-      <w:proofErr w:type="spellStart"/>
-      <w:r>
-        <w:t>values_dataset.json</w:t>
-      </w:r>
-      <w:proofErr w:type="spellEnd"/>
-    </w:p>
-    <w:p>
-      <w:pPr>
-        <w:numPr>
-          <w:ilvl w:val="1"/>
-          <w:numId w:val="16"/>
-        </w:numPr>
-      </w:pPr>
-      <w:proofErr w:type="spellStart"/>
-      <w:r>
-        <w:t>scraping</w:t>
-      </w:r>
-      <w:proofErr w:type="spellEnd"/>
-      <w:r>
-        <w:t>/</w:t>
-      </w:r>
-      <w:proofErr w:type="spellStart"/>
-      <w:r>
-        <w:t>courses_dataset.json</w:t>
-      </w:r>
-      <w:proofErr w:type="spellEnd"/>
-    </w:p>
-    <w:p>
-      <w:pPr>
-        <w:numPr>
-          <w:ilvl w:val="1"/>
-          <w:numId w:val="16"/>
-        </w:numPr>
-      </w:pPr>
-      <w:r>
-        <w:t>hr_copilot/hr_copilot_tool.py</w:t>
-      </w:r>
-    </w:p>
-    <w:p>
-      <w:pPr>
-        <w:numPr>
-          <w:ilvl w:val="1"/>
-          <w:numId w:val="16"/>
-        </w:numPr>
-      </w:pPr>
-      <w:r>
-        <w:t>hr_copilot/prompt_templates.py</w:t>
-      </w:r>
-    </w:p>
-    <w:p>
-      <w:pPr>
-        <w:numPr>
-          <w:ilvl w:val="1"/>
-          <w:numId w:val="16"/>
-        </w:numPr>
-      </w:pPr>
-      <w:r>
-        <w:t>matching/matching_engine.py</w:t>
-      </w:r>
-    </w:p>
-    <w:p>
-      <w:pPr>
-        <w:numPr>
-          <w:ilvl w:val="1"/>
-          <w:numId w:val="16"/>
-        </w:numPr>
-      </w:pPr>
-      <w:r>
-        <w:t>matching/team_fit.py</w:t>
-      </w:r>
-    </w:p>
-    <w:p>
-      <w:pPr>
-        <w:numPr>
-          <w:ilvl w:val="1"/>
-          <w:numId w:val="16"/>
-        </w:numPr>
-      </w:pPr>
-      <w:r>
-        <w:t>matching/co_teaching.py</w:t>
+      <w:r>
+        <w:t>profile.py</w:t>
       </w:r>
     </w:p>
     <w:p>
       <w:pPr>
         <w:numPr>
           <w:ilvl w:val="0"/>
-          <w:numId w:val="16"/>
+          <w:numId w:val="20"/>
         </w:numPr>
       </w:pPr>
-      <w:proofErr w:type="spellStart"/>
-      <w:r>
-        <w:t>models</w:t>
-      </w:r>
-      <w:proofErr w:type="spellEnd"/>
-      <w:r>
-        <w:t>/ (</w:t>
-      </w:r>
-      <w:proofErr w:type="spellStart"/>
-      <w:r>
-        <w:t>SQLAlchemy</w:t>
-      </w:r>
-      <w:proofErr w:type="spellEnd"/>
-      <w:r>
-        <w:t>)</w:t>
-      </w:r>
-    </w:p>
-    <w:p>
-      <w:pPr>
-        <w:numPr>
-          <w:ilvl w:val="1"/>
-          <w:numId w:val="16"/>
-        </w:numPr>
-      </w:pPr>
-      <w:r>
-        <w:t xml:space="preserve">base.py (Base, </w:t>
-      </w:r>
-      <w:proofErr w:type="spellStart"/>
-      <w:r>
-        <w:t>TimestampMixin</w:t>
-      </w:r>
-      <w:proofErr w:type="spellEnd"/>
-      <w:r>
-        <w:t>)</w:t>
-      </w:r>
-    </w:p>
-    <w:p>
-      <w:pPr>
-        <w:numPr>
-          <w:ilvl w:val="1"/>
-          <w:numId w:val="16"/>
-        </w:numPr>
-      </w:pPr>
-      <w:r>
-        <w:t>users.py (</w:t>
-      </w:r>
-      <w:proofErr w:type="spellStart"/>
-      <w:r>
-        <w:t>User</w:t>
-      </w:r>
-      <w:proofErr w:type="spellEnd"/>
-      <w:r>
-        <w:t>)</w:t>
-      </w:r>
-    </w:p>
-    <w:p>
-      <w:pPr>
-        <w:numPr>
-          <w:ilvl w:val="1"/>
-          <w:numId w:val="16"/>
-        </w:numPr>
-      </w:pPr>
-      <w:r>
-        <w:t>candidates.py (Candidate)</w:t>
-      </w:r>
-    </w:p>
-    <w:p>
-      <w:pPr>
-        <w:numPr>
-          <w:ilvl w:val="1"/>
-          <w:numId w:val="16"/>
-        </w:numPr>
-      </w:pPr>
       <w:r>
         <w:lastRenderedPageBreak/>
-        <w:t xml:space="preserve">companies.py (Company, </w:t>
-      </w:r>
-      <w:proofErr w:type="spellStart"/>
-      <w:r>
-        <w:t>CompanyCulture</w:t>
-      </w:r>
-      <w:proofErr w:type="spellEnd"/>
-      <w:r>
-        <w:t>)</w:t>
-      </w:r>
-    </w:p>
-    <w:p>
-      <w:pPr>
-        <w:numPr>
-          <w:ilvl w:val="1"/>
-          <w:numId w:val="16"/>
-        </w:numPr>
-      </w:pPr>
-      <w:r>
-        <w:t xml:space="preserve">jobs.py (Job, </w:t>
-      </w:r>
-      <w:proofErr w:type="spellStart"/>
-      <w:r>
-        <w:t>TeamProfile</w:t>
-      </w:r>
-      <w:proofErr w:type="spellEnd"/>
-      <w:r>
-        <w:t xml:space="preserve">, </w:t>
-      </w:r>
-      <w:proofErr w:type="spellStart"/>
-      <w:r>
-        <w:t>TeamMember</w:t>
-      </w:r>
-      <w:proofErr w:type="spellEnd"/>
-      <w:r>
-        <w:t xml:space="preserve">, </w:t>
-      </w:r>
-      <w:proofErr w:type="spellStart"/>
-      <w:r>
-        <w:t>Application</w:t>
-      </w:r>
-      <w:proofErr w:type="spellEnd"/>
-      <w:r>
-        <w:t xml:space="preserve">, </w:t>
-      </w:r>
-      <w:proofErr w:type="spellStart"/>
-      <w:r>
-        <w:t>JobRecommendation</w:t>
-      </w:r>
-      <w:proofErr w:type="spellEnd"/>
-      <w:r>
-        <w:t xml:space="preserve">, </w:t>
-      </w:r>
-      <w:proofErr w:type="spellStart"/>
-      <w:r>
-        <w:t>CoTeachingPair</w:t>
-      </w:r>
-      <w:proofErr w:type="spellEnd"/>
-      <w:r>
-        <w:t>)</w:t>
-      </w:r>
-    </w:p>
-    <w:p>
-      <w:pPr>
-        <w:numPr>
-          <w:ilvl w:val="1"/>
-          <w:numId w:val="16"/>
-        </w:numPr>
-      </w:pPr>
-      <w:r>
-        <w:t>interviews.py (</w:t>
-      </w:r>
-      <w:proofErr w:type="spellStart"/>
-      <w:r>
-        <w:t>CandidateInterview</w:t>
-      </w:r>
-      <w:proofErr w:type="spellEnd"/>
-      <w:r>
-        <w:t xml:space="preserve"> – HR </w:t>
-      </w:r>
-      <w:proofErr w:type="spellStart"/>
-      <w:r>
-        <w:t>Copilot</w:t>
-      </w:r>
-      <w:proofErr w:type="spellEnd"/>
-      <w:r>
-        <w:t>)</w:t>
-      </w:r>
-    </w:p>
-    <w:p>
-      <w:pPr>
-        <w:numPr>
-          <w:ilvl w:val="1"/>
-          <w:numId w:val="16"/>
-        </w:numPr>
-      </w:pPr>
-      <w:r>
-        <w:t>skills.py (</w:t>
-      </w:r>
-      <w:proofErr w:type="spellStart"/>
-      <w:r>
-        <w:t>CandidateSkill</w:t>
-      </w:r>
-      <w:proofErr w:type="spellEnd"/>
-      <w:r>
-        <w:t xml:space="preserve">, </w:t>
-      </w:r>
-      <w:proofErr w:type="spellStart"/>
-      <w:r>
-        <w:t>JobSkill</w:t>
-      </w:r>
-      <w:proofErr w:type="spellEnd"/>
-      <w:r>
-        <w:t>)</w:t>
+        <w:t>create_job.py</w:t>
       </w:r>
     </w:p>
     <w:p>
       <w:pPr>
         <w:numPr>
           <w:ilvl w:val="0"/>
-          <w:numId w:val="16"/>
+          <w:numId w:val="20"/>
         </w:numPr>
       </w:pPr>
+      <w:r>
+        <w:t>analytics.py</w:t>
+      </w:r>
+    </w:p>
+    <w:p>
+      <w:pPr>
+        <w:numPr>
+          <w:ilvl w:val="0"/>
+          <w:numId w:val="20"/>
+        </w:numPr>
+      </w:pPr>
+      <w:r>
+        <w:t>co_teaching.py</w:t>
+      </w:r>
+    </w:p>
+    <w:p>
+      <w:proofErr w:type="spellStart"/>
+      <w:r>
+        <w:t>backend</w:t>
+      </w:r>
+      <w:proofErr w:type="spellEnd"/>
+      <w:r>
+        <w:t>/</w:t>
+      </w:r>
+      <w:proofErr w:type="gramStart"/>
+      <w:r>
+        <w:t>app</w:t>
+      </w:r>
+      <w:proofErr w:type="gramEnd"/>
+      <w:r>
+        <w:t>/</w:t>
+      </w:r>
+      <w:r>
+        <w:br/>
+        <w:t>• main.py</w:t>
+      </w:r>
+      <w:r>
+        <w:br/>
+        <w:t xml:space="preserve">• </w:t>
+      </w:r>
+      <w:proofErr w:type="spellStart"/>
+      <w:r>
+        <w:t>routers</w:t>
+      </w:r>
+      <w:proofErr w:type="spellEnd"/>
+      <w:r>
+        <w:t>/</w:t>
+      </w:r>
+    </w:p>
+    <w:p>
+      <w:pPr>
+        <w:numPr>
+          <w:ilvl w:val="0"/>
+          <w:numId w:val="21"/>
+        </w:numPr>
+      </w:pPr>
+      <w:r>
+        <w:t xml:space="preserve">auth.py # </w:t>
+      </w:r>
+      <w:proofErr w:type="spellStart"/>
+      <w:r>
+        <w:t>Login</w:t>
+      </w:r>
+      <w:proofErr w:type="spellEnd"/>
+      <w:r>
+        <w:t xml:space="preserve"> real con creación automática de usuario + perfil</w:t>
+      </w:r>
+    </w:p>
+    <w:p>
+      <w:pPr>
+        <w:numPr>
+          <w:ilvl w:val="0"/>
+          <w:numId w:val="21"/>
+        </w:numPr>
+      </w:pPr>
+      <w:r>
+        <w:t>candidates.py</w:t>
+      </w:r>
+    </w:p>
+    <w:p>
+      <w:pPr>
+        <w:numPr>
+          <w:ilvl w:val="0"/>
+          <w:numId w:val="21"/>
+        </w:numPr>
+      </w:pPr>
+      <w:r>
+        <w:t>companies.py</w:t>
+      </w:r>
+    </w:p>
+    <w:p>
+      <w:pPr>
+        <w:numPr>
+          <w:ilvl w:val="0"/>
+          <w:numId w:val="21"/>
+        </w:numPr>
+      </w:pPr>
+      <w:r>
+        <w:t>jobs.py</w:t>
+      </w:r>
+    </w:p>
+    <w:p>
+      <w:pPr>
+        <w:numPr>
+          <w:ilvl w:val="0"/>
+          <w:numId w:val="21"/>
+        </w:numPr>
+      </w:pPr>
+      <w:r>
+        <w:t>copilot.py</w:t>
+      </w:r>
+    </w:p>
+    <w:p>
+      <w:pPr>
+        <w:numPr>
+          <w:ilvl w:val="0"/>
+          <w:numId w:val="21"/>
+        </w:numPr>
+      </w:pPr>
+      <w:r>
+        <w:t>matching.py</w:t>
+      </w:r>
+      <w:r>
+        <w:br/>
+        <w:t xml:space="preserve">• </w:t>
+      </w:r>
+      <w:proofErr w:type="spellStart"/>
+      <w:r>
+        <w:t>services</w:t>
+      </w:r>
+      <w:proofErr w:type="spellEnd"/>
+      <w:r>
+        <w:t>/</w:t>
+      </w:r>
+    </w:p>
+    <w:p>
+      <w:pPr>
+        <w:numPr>
+          <w:ilvl w:val="0"/>
+          <w:numId w:val="21"/>
+        </w:numPr>
+      </w:pPr>
+      <w:r>
+        <w:t>mcp_client.py</w:t>
+      </w:r>
+    </w:p>
+    <w:p>
+      <w:pPr>
+        <w:numPr>
+          <w:ilvl w:val="0"/>
+          <w:numId w:val="21"/>
+        </w:numPr>
+      </w:pPr>
+      <w:r>
+        <w:t>ocr/document_parser.py</w:t>
+      </w:r>
+    </w:p>
+    <w:p>
+      <w:pPr>
+        <w:numPr>
+          <w:ilvl w:val="0"/>
+          <w:numId w:val="21"/>
+        </w:numPr>
+      </w:pPr>
+      <w:r>
+        <w:t>skills/skills_extractor.py</w:t>
+      </w:r>
+    </w:p>
+    <w:p>
+      <w:pPr>
+        <w:numPr>
+          <w:ilvl w:val="0"/>
+          <w:numId w:val="21"/>
+        </w:numPr>
+      </w:pPr>
+      <w:proofErr w:type="spellStart"/>
+      <w:r>
+        <w:t>skills</w:t>
+      </w:r>
+      <w:proofErr w:type="spellEnd"/>
+      <w:r>
+        <w:t>/</w:t>
+      </w:r>
+      <w:proofErr w:type="spellStart"/>
+      <w:r>
+        <w:t>skills_dictionary.json</w:t>
+      </w:r>
+      <w:proofErr w:type="spellEnd"/>
+    </w:p>
+    <w:p>
+      <w:pPr>
+        <w:numPr>
+          <w:ilvl w:val="0"/>
+          <w:numId w:val="21"/>
+        </w:numPr>
+      </w:pPr>
+      <w:r>
+        <w:t>scraping/values_scraper.py</w:t>
+      </w:r>
+    </w:p>
+    <w:p>
+      <w:pPr>
+        <w:numPr>
+          <w:ilvl w:val="0"/>
+          <w:numId w:val="21"/>
+        </w:numPr>
+      </w:pPr>
+      <w:r>
+        <w:t>scraping/courses_scraper.py</w:t>
+      </w:r>
+    </w:p>
+    <w:p>
+      <w:pPr>
+        <w:numPr>
+          <w:ilvl w:val="0"/>
+          <w:numId w:val="21"/>
+        </w:numPr>
+      </w:pPr>
+      <w:proofErr w:type="spellStart"/>
+      <w:r>
+        <w:t>scraping</w:t>
+      </w:r>
+      <w:proofErr w:type="spellEnd"/>
+      <w:r>
+        <w:t>/</w:t>
+      </w:r>
+      <w:proofErr w:type="spellStart"/>
+      <w:r>
+        <w:t>values_dataset.json</w:t>
+      </w:r>
+      <w:proofErr w:type="spellEnd"/>
+    </w:p>
+    <w:p>
+      <w:pPr>
+        <w:numPr>
+          <w:ilvl w:val="0"/>
+          <w:numId w:val="21"/>
+        </w:numPr>
+      </w:pPr>
+      <w:proofErr w:type="spellStart"/>
+      <w:r>
+        <w:t>scraping</w:t>
+      </w:r>
+      <w:proofErr w:type="spellEnd"/>
+      <w:r>
+        <w:t>/</w:t>
+      </w:r>
+      <w:proofErr w:type="spellStart"/>
+      <w:r>
+        <w:t>courses_dataset.json</w:t>
+      </w:r>
+      <w:proofErr w:type="spellEnd"/>
+    </w:p>
+    <w:p>
+      <w:pPr>
+        <w:numPr>
+          <w:ilvl w:val="0"/>
+          <w:numId w:val="21"/>
+        </w:numPr>
+      </w:pPr>
+      <w:r>
+        <w:t>hr_copilot/hr_copilot_tool.py</w:t>
+      </w:r>
+    </w:p>
+    <w:p>
+      <w:pPr>
+        <w:numPr>
+          <w:ilvl w:val="0"/>
+          <w:numId w:val="21"/>
+        </w:numPr>
+      </w:pPr>
+      <w:r>
+        <w:t>hr_copilot/prompt_templates.py</w:t>
+      </w:r>
+    </w:p>
+    <w:p>
+      <w:pPr>
+        <w:numPr>
+          <w:ilvl w:val="0"/>
+          <w:numId w:val="21"/>
+        </w:numPr>
+      </w:pPr>
+      <w:r>
+        <w:t>matching/matching_engine.py</w:t>
+      </w:r>
+    </w:p>
+    <w:p>
+      <w:pPr>
+        <w:numPr>
+          <w:ilvl w:val="0"/>
+          <w:numId w:val="21"/>
+        </w:numPr>
+      </w:pPr>
+      <w:r>
+        <w:t>matching/team_fit.py</w:t>
+      </w:r>
+    </w:p>
+    <w:p>
+      <w:pPr>
+        <w:numPr>
+          <w:ilvl w:val="0"/>
+          <w:numId w:val="21"/>
+        </w:numPr>
+      </w:pPr>
+      <w:r>
+        <w:t>matching/co_teaching.py</w:t>
+      </w:r>
+      <w:r>
+        <w:br/>
+        <w:t xml:space="preserve">• </w:t>
+      </w:r>
+      <w:proofErr w:type="spellStart"/>
+      <w:r>
+        <w:t>models</w:t>
+      </w:r>
+      <w:proofErr w:type="spellEnd"/>
+      <w:r>
+        <w:t>/ (</w:t>
+      </w:r>
+      <w:proofErr w:type="spellStart"/>
+      <w:r>
+        <w:t>SQLAlchemy</w:t>
+      </w:r>
+      <w:proofErr w:type="spellEnd"/>
+      <w:r>
+        <w:t>)</w:t>
+      </w:r>
+    </w:p>
+    <w:p>
+      <w:pPr>
+        <w:numPr>
+          <w:ilvl w:val="0"/>
+          <w:numId w:val="21"/>
+        </w:numPr>
+      </w:pPr>
+      <w:r>
+        <w:t xml:space="preserve">base.py (Base, </w:t>
+      </w:r>
+      <w:proofErr w:type="spellStart"/>
+      <w:r>
+        <w:t>TimestampMixin</w:t>
+      </w:r>
+      <w:proofErr w:type="spellEnd"/>
+      <w:r>
+        <w:t>)</w:t>
+      </w:r>
+    </w:p>
+    <w:p>
+      <w:pPr>
+        <w:numPr>
+          <w:ilvl w:val="0"/>
+          <w:numId w:val="21"/>
+        </w:numPr>
+      </w:pPr>
+      <w:r>
+        <w:t>users.py (</w:t>
+      </w:r>
+      <w:proofErr w:type="spellStart"/>
+      <w:r>
+        <w:t>User</w:t>
+      </w:r>
+      <w:proofErr w:type="spellEnd"/>
+      <w:r>
+        <w:t>)</w:t>
+      </w:r>
+    </w:p>
+    <w:p>
+      <w:pPr>
+        <w:numPr>
+          <w:ilvl w:val="0"/>
+          <w:numId w:val="21"/>
+        </w:numPr>
+      </w:pPr>
+      <w:r>
+        <w:lastRenderedPageBreak/>
+        <w:t>candidates.py (Candidate)</w:t>
+      </w:r>
+    </w:p>
+    <w:p>
+      <w:pPr>
+        <w:numPr>
+          <w:ilvl w:val="0"/>
+          <w:numId w:val="21"/>
+        </w:numPr>
+      </w:pPr>
+      <w:r>
+        <w:t xml:space="preserve">companies.py (Company, </w:t>
+      </w:r>
+      <w:proofErr w:type="spellStart"/>
+      <w:r>
+        <w:t>CompanyCulture</w:t>
+      </w:r>
+      <w:proofErr w:type="spellEnd"/>
+      <w:r>
+        <w:t>)</w:t>
+      </w:r>
+    </w:p>
+    <w:p>
+      <w:pPr>
+        <w:numPr>
+          <w:ilvl w:val="0"/>
+          <w:numId w:val="21"/>
+        </w:numPr>
+      </w:pPr>
+      <w:r>
+        <w:t xml:space="preserve">jobs.py (Job, </w:t>
+      </w:r>
+      <w:proofErr w:type="spellStart"/>
+      <w:r>
+        <w:t>TeamProfile</w:t>
+      </w:r>
+      <w:proofErr w:type="spellEnd"/>
+      <w:r>
+        <w:t xml:space="preserve">, </w:t>
+      </w:r>
+      <w:proofErr w:type="spellStart"/>
+      <w:r>
+        <w:t>TeamMember</w:t>
+      </w:r>
+      <w:proofErr w:type="spellEnd"/>
+      <w:r>
+        <w:t xml:space="preserve">, </w:t>
+      </w:r>
+      <w:proofErr w:type="spellStart"/>
+      <w:r>
+        <w:t>Application</w:t>
+      </w:r>
+      <w:proofErr w:type="spellEnd"/>
+      <w:r>
+        <w:t xml:space="preserve">, </w:t>
+      </w:r>
+      <w:proofErr w:type="spellStart"/>
+      <w:r>
+        <w:t>JobRecommendation</w:t>
+      </w:r>
+      <w:proofErr w:type="spellEnd"/>
+      <w:r>
+        <w:t xml:space="preserve">, </w:t>
+      </w:r>
+      <w:proofErr w:type="spellStart"/>
+      <w:r>
+        <w:t>CoTeachingPair</w:t>
+      </w:r>
+      <w:proofErr w:type="spellEnd"/>
+      <w:r>
+        <w:t>)</w:t>
+      </w:r>
+    </w:p>
+    <w:p>
+      <w:pPr>
+        <w:numPr>
+          <w:ilvl w:val="0"/>
+          <w:numId w:val="21"/>
+        </w:numPr>
+      </w:pPr>
+      <w:r>
+        <w:t>interviews.py (</w:t>
+      </w:r>
+      <w:proofErr w:type="spellStart"/>
+      <w:r>
+        <w:t>CandidateInterview</w:t>
+      </w:r>
+      <w:proofErr w:type="spellEnd"/>
+      <w:r>
+        <w:t xml:space="preserve"> – HR </w:t>
+      </w:r>
+      <w:proofErr w:type="spellStart"/>
+      <w:r>
+        <w:t>Copilot</w:t>
+      </w:r>
+      <w:proofErr w:type="spellEnd"/>
+      <w:r>
+        <w:t>)</w:t>
+      </w:r>
+    </w:p>
+    <w:p>
+      <w:pPr>
+        <w:numPr>
+          <w:ilvl w:val="0"/>
+          <w:numId w:val="21"/>
+        </w:numPr>
+      </w:pPr>
+      <w:r>
+        <w:t>skills.py (</w:t>
+      </w:r>
+      <w:proofErr w:type="spellStart"/>
+      <w:r>
+        <w:t>CandidateSkill</w:t>
+      </w:r>
+      <w:proofErr w:type="spellEnd"/>
+      <w:r>
+        <w:t xml:space="preserve">, </w:t>
+      </w:r>
+      <w:proofErr w:type="spellStart"/>
+      <w:r>
+        <w:t>JobSkill</w:t>
+      </w:r>
+      <w:proofErr w:type="spellEnd"/>
+      <w:r>
+        <w:t>)</w:t>
+      </w:r>
+      <w:r>
+        <w:br/>
+        <w:t xml:space="preserve">• </w:t>
+      </w:r>
       <w:proofErr w:type="spellStart"/>
       <w:r>
         <w:t>db</w:t>
@@ -896,8 +951,8 @@
     <w:p>
       <w:pPr>
         <w:numPr>
-          <w:ilvl w:val="1"/>
-          <w:numId w:val="16"/>
+          <w:ilvl w:val="0"/>
+          <w:numId w:val="21"/>
         </w:numPr>
       </w:pPr>
       <w:r>
@@ -923,8 +978,8 @@
     <w:p>
       <w:pPr>
         <w:numPr>
-          <w:ilvl w:val="1"/>
-          <w:numId w:val="16"/>
+          <w:ilvl w:val="0"/>
+          <w:numId w:val="21"/>
         </w:numPr>
       </w:pPr>
       <w:r>
@@ -946,7 +1001,7 @@
     </w:p>
     <w:p>
       <w:r>
-        <w:pict w14:anchorId="16005FB2">
+        <w:pict w14:anchorId="5775550B">
           <v:rect id="_x0000_i1131" style="width:0;height:1.5pt" o:hralign="center" o:hrstd="t" o:hr="t" fillcolor="#a0a0a0" stroked="f"/>
         </w:pict>
       </w:r>
@@ -966,7 +1021,7 @@
       <w:pPr>
         <w:numPr>
           <w:ilvl w:val="0"/>
-          <w:numId w:val="17"/>
+          <w:numId w:val="22"/>
         </w:numPr>
       </w:pPr>
       <w:proofErr w:type="spellStart"/>
@@ -1080,7 +1135,7 @@
       <w:pPr>
         <w:numPr>
           <w:ilvl w:val="0"/>
-          <w:numId w:val="17"/>
+          <w:numId w:val="22"/>
         </w:numPr>
       </w:pPr>
       <w:proofErr w:type="spellStart"/>
@@ -1189,7 +1244,7 @@
       <w:pPr>
         <w:numPr>
           <w:ilvl w:val="0"/>
-          <w:numId w:val="17"/>
+          <w:numId w:val="22"/>
         </w:numPr>
       </w:pPr>
       <w:r>
@@ -1261,7 +1316,7 @@
       <w:pPr>
         <w:numPr>
           <w:ilvl w:val="0"/>
-          <w:numId w:val="17"/>
+          <w:numId w:val="22"/>
         </w:numPr>
       </w:pPr>
       <w:proofErr w:type="spellStart"/>
@@ -1378,7 +1433,7 @@
       <w:pPr>
         <w:numPr>
           <w:ilvl w:val="0"/>
-          <w:numId w:val="17"/>
+          <w:numId w:val="22"/>
         </w:numPr>
       </w:pPr>
       <w:r>
@@ -1457,7 +1512,7 @@
       <w:pPr>
         <w:numPr>
           <w:ilvl w:val="0"/>
-          <w:numId w:val="17"/>
+          <w:numId w:val="22"/>
         </w:numPr>
       </w:pPr>
       <w:proofErr w:type="spellStart"/>
@@ -1510,7 +1565,7 @@
     </w:p>
     <w:p>
       <w:r>
-        <w:pict w14:anchorId="2763F9EB">
+        <w:pict w14:anchorId="4B4C706B">
           <v:rect id="_x0000_i1132" style="width:0;height:1.5pt" o:hralign="center" o:hrstd="t" o:hr="t" fillcolor="#a0a0a0" stroked="f"/>
         </w:pict>
       </w:r>
@@ -1544,21 +1599,277 @@
     </w:p>
     <w:p>
       <w:r>
+        <w:lastRenderedPageBreak/>
         <w:t xml:space="preserve">Totalmente separado por roles mediante </w:t>
       </w:r>
       <w:proofErr w:type="spellStart"/>
-      <w:r>
-        <w:t>session_state</w:t>
-      </w:r>
-      <w:proofErr w:type="spellEnd"/>
-      <w:r>
-        <w:t>["role"]:</w:t>
-      </w:r>
-    </w:p>
-    <w:p>
-      <w:r>
-        <w:lastRenderedPageBreak/>
-        <w:t>Portal Candidato</w:t>
+      <w:proofErr w:type="gramStart"/>
+      <w:r>
+        <w:t>st.session</w:t>
+      </w:r>
+      <w:proofErr w:type="gramEnd"/>
+      <w:r>
+        <w:t>_state</w:t>
+      </w:r>
+      <w:proofErr w:type="spellEnd"/>
+      <w:r>
+        <w:t xml:space="preserve">["role"] y </w:t>
+      </w:r>
+      <w:proofErr w:type="spellStart"/>
+      <w:proofErr w:type="gramStart"/>
+      <w:r>
+        <w:t>st.session</w:t>
+      </w:r>
+      <w:proofErr w:type="gramEnd"/>
+      <w:r>
+        <w:t>_</w:t>
+      </w:r>
+      <w:proofErr w:type="gramStart"/>
+      <w:r>
+        <w:t>state.auth</w:t>
+      </w:r>
+      <w:proofErr w:type="spellEnd"/>
+      <w:proofErr w:type="gramEnd"/>
+      <w:r>
+        <w:t>:</w:t>
+      </w:r>
+    </w:p>
+    <w:p>
+      <w:proofErr w:type="spellStart"/>
+      <w:proofErr w:type="gramStart"/>
+      <w:r>
+        <w:t>st.session</w:t>
+      </w:r>
+      <w:proofErr w:type="gramEnd"/>
+      <w:r>
+        <w:t>_</w:t>
+      </w:r>
+      <w:proofErr w:type="gramStart"/>
+      <w:r>
+        <w:t>state.auth</w:t>
+      </w:r>
+      <w:proofErr w:type="spellEnd"/>
+      <w:proofErr w:type="gramEnd"/>
+      <w:r>
+        <w:t xml:space="preserve"> = {</w:t>
+      </w:r>
+    </w:p>
+    <w:p>
+      <w:r>
+        <w:t xml:space="preserve">    "</w:t>
+      </w:r>
+      <w:proofErr w:type="spellStart"/>
+      <w:r>
+        <w:t>is_authenticated</w:t>
+      </w:r>
+      <w:proofErr w:type="spellEnd"/>
+      <w:r>
+        <w:t xml:space="preserve">": </w:t>
+      </w:r>
+      <w:proofErr w:type="spellStart"/>
+      <w:r>
+        <w:t>bool</w:t>
+      </w:r>
+      <w:proofErr w:type="spellEnd"/>
+      <w:r>
+        <w:t>,</w:t>
+      </w:r>
+    </w:p>
+    <w:p>
+      <w:r>
+        <w:t xml:space="preserve">    "</w:t>
+      </w:r>
+      <w:proofErr w:type="spellStart"/>
+      <w:r>
+        <w:t>user_id</w:t>
+      </w:r>
+      <w:proofErr w:type="spellEnd"/>
+      <w:r>
+        <w:t xml:space="preserve">": </w:t>
+      </w:r>
+      <w:proofErr w:type="spellStart"/>
+      <w:r>
+        <w:t>int</w:t>
+      </w:r>
+      <w:proofErr w:type="spellEnd"/>
+      <w:r>
+        <w:t xml:space="preserve"> | </w:t>
+      </w:r>
+      <w:proofErr w:type="spellStart"/>
+      <w:r>
+        <w:t>None</w:t>
+      </w:r>
+      <w:proofErr w:type="spellEnd"/>
+      <w:r>
+        <w:t>,</w:t>
+      </w:r>
+    </w:p>
+    <w:p>
+      <w:r>
+        <w:t xml:space="preserve">    "email": </w:t>
+      </w:r>
+      <w:proofErr w:type="spellStart"/>
+      <w:r>
+        <w:t>str</w:t>
+      </w:r>
+      <w:proofErr w:type="spellEnd"/>
+      <w:r>
+        <w:t xml:space="preserve"> | </w:t>
+      </w:r>
+      <w:proofErr w:type="spellStart"/>
+      <w:r>
+        <w:t>None</w:t>
+      </w:r>
+      <w:proofErr w:type="spellEnd"/>
+      <w:r>
+        <w:t>,</w:t>
+      </w:r>
+    </w:p>
+    <w:p>
+      <w:r>
+        <w:t>}</w:t>
+      </w:r>
+    </w:p>
+    <w:p>
+      <w:proofErr w:type="spellStart"/>
+      <w:proofErr w:type="gramStart"/>
+      <w:r>
+        <w:t>st.session</w:t>
+      </w:r>
+      <w:proofErr w:type="gramEnd"/>
+      <w:r>
+        <w:t>_</w:t>
+      </w:r>
+      <w:proofErr w:type="gramStart"/>
+      <w:r>
+        <w:t>state.role</w:t>
+      </w:r>
+      <w:proofErr w:type="spellEnd"/>
+      <w:proofErr w:type="gramEnd"/>
+      <w:r>
+        <w:t xml:space="preserve"> = "candidate" | "</w:t>
+      </w:r>
+      <w:proofErr w:type="spellStart"/>
+      <w:r>
+        <w:t>company</w:t>
+      </w:r>
+      <w:proofErr w:type="spellEnd"/>
+      <w:r>
+        <w:t>"</w:t>
+      </w:r>
+    </w:p>
+    <w:p>
+      <w:proofErr w:type="spellStart"/>
+      <w:proofErr w:type="gramStart"/>
+      <w:r>
+        <w:t>st.session</w:t>
+      </w:r>
+      <w:proofErr w:type="gramEnd"/>
+      <w:r>
+        <w:t>_</w:t>
+      </w:r>
+      <w:proofErr w:type="gramStart"/>
+      <w:r>
+        <w:t>state.candidate</w:t>
+      </w:r>
+      <w:proofErr w:type="gramEnd"/>
+      <w:r>
+        <w:t>_id</w:t>
+      </w:r>
+      <w:proofErr w:type="spellEnd"/>
+      <w:r>
+        <w:t xml:space="preserve"> = </w:t>
+      </w:r>
+      <w:proofErr w:type="spellStart"/>
+      <w:r>
+        <w:t>int</w:t>
+      </w:r>
+      <w:proofErr w:type="spellEnd"/>
+      <w:r>
+        <w:t xml:space="preserve"> | </w:t>
+      </w:r>
+      <w:proofErr w:type="spellStart"/>
+      <w:r>
+        <w:t>None</w:t>
+      </w:r>
+      <w:proofErr w:type="spellEnd"/>
+    </w:p>
+    <w:p>
+      <w:proofErr w:type="spellStart"/>
+      <w:proofErr w:type="gramStart"/>
+      <w:r>
+        <w:t>st.session</w:t>
+      </w:r>
+      <w:proofErr w:type="gramEnd"/>
+      <w:r>
+        <w:t>_</w:t>
+      </w:r>
+      <w:proofErr w:type="gramStart"/>
+      <w:r>
+        <w:t>state.company</w:t>
+      </w:r>
+      <w:proofErr w:type="gramEnd"/>
+      <w:r>
+        <w:t>_id</w:t>
+      </w:r>
+      <w:proofErr w:type="spellEnd"/>
+      <w:r>
+        <w:t xml:space="preserve"> = </w:t>
+      </w:r>
+      <w:proofErr w:type="spellStart"/>
+      <w:r>
+        <w:t>int</w:t>
+      </w:r>
+      <w:proofErr w:type="spellEnd"/>
+      <w:r>
+        <w:t xml:space="preserve"> | </w:t>
+      </w:r>
+      <w:proofErr w:type="spellStart"/>
+      <w:r>
+        <w:t>None</w:t>
+      </w:r>
+      <w:proofErr w:type="spellEnd"/>
+    </w:p>
+    <w:p>
+      <w:proofErr w:type="spellStart"/>
+      <w:proofErr w:type="gramStart"/>
+      <w:r>
+        <w:t>st.session</w:t>
+      </w:r>
+      <w:proofErr w:type="gramEnd"/>
+      <w:r>
+        <w:t>_</w:t>
+      </w:r>
+      <w:proofErr w:type="gramStart"/>
+      <w:r>
+        <w:t>state.current</w:t>
+      </w:r>
+      <w:proofErr w:type="gramEnd"/>
+      <w:r>
+        <w:t>_page</w:t>
+      </w:r>
+      <w:proofErr w:type="spellEnd"/>
+      <w:r>
+        <w:t xml:space="preserve"> = "Inicio" | ...</w:t>
+      </w:r>
+    </w:p>
+    <w:p>
+      <w:r>
+        <w:rPr>
+          <w:rFonts w:ascii="Segoe UI Emoji" w:hAnsi="Segoe UI Emoji" w:cs="Segoe UI Emoji"/>
+        </w:rPr>
+        <w:t>🔐</w:t>
+      </w:r>
+      <w:r>
+        <w:t xml:space="preserve"> </w:t>
+      </w:r>
+      <w:proofErr w:type="spellStart"/>
+      <w:r>
+        <w:t>Login</w:t>
+      </w:r>
+      <w:proofErr w:type="spellEnd"/>
+      <w:r>
+        <w:t xml:space="preserve"> real en frontend/app.py</w:t>
       </w:r>
       <w:r>
         <w:br/>
@@ -1566,6 +1877,209 @@
       </w:r>
       <w:proofErr w:type="spellStart"/>
       <w:r>
+        <w:t>render_login_</w:t>
+      </w:r>
+      <w:proofErr w:type="gramStart"/>
+      <w:r>
+        <w:t>card</w:t>
+      </w:r>
+      <w:proofErr w:type="spellEnd"/>
+      <w:r>
+        <w:t>(</w:t>
+      </w:r>
+      <w:proofErr w:type="gramEnd"/>
+      <w:r>
+        <w:t>) muestra radio: “</w:t>
+      </w:r>
+      <w:r>
+        <w:rPr>
+          <w:rFonts w:ascii="Segoe UI Emoji" w:hAnsi="Segoe UI Emoji" w:cs="Segoe UI Emoji"/>
+        </w:rPr>
+        <w:t>👤</w:t>
+      </w:r>
+      <w:r>
+        <w:t xml:space="preserve"> Candidato” / “</w:t>
+      </w:r>
+      <w:r>
+        <w:rPr>
+          <w:rFonts w:ascii="Segoe UI Emoji" w:hAnsi="Segoe UI Emoji" w:cs="Segoe UI Emoji"/>
+        </w:rPr>
+        <w:t>🏢</w:t>
+      </w:r>
+      <w:r>
+        <w:t xml:space="preserve"> Empresa” + email + contraseña.</w:t>
+      </w:r>
+      <w:r>
+        <w:br/>
+        <w:t>• Al enviar, llama a POST /</w:t>
+      </w:r>
+      <w:proofErr w:type="spellStart"/>
+      <w:r>
+        <w:t>auth</w:t>
+      </w:r>
+      <w:proofErr w:type="spellEnd"/>
+      <w:r>
+        <w:t>/</w:t>
+      </w:r>
+      <w:proofErr w:type="spellStart"/>
+      <w:r>
+        <w:t>login</w:t>
+      </w:r>
+      <w:proofErr w:type="spellEnd"/>
+      <w:r>
+        <w:t xml:space="preserve"> en el </w:t>
+      </w:r>
+      <w:proofErr w:type="spellStart"/>
+      <w:r>
+        <w:t>backend</w:t>
+      </w:r>
+      <w:proofErr w:type="spellEnd"/>
+      <w:r>
+        <w:t xml:space="preserve"> (usando </w:t>
+      </w:r>
+      <w:proofErr w:type="spellStart"/>
+      <w:r>
+        <w:t>get_backend_</w:t>
+      </w:r>
+      <w:proofErr w:type="gramStart"/>
+      <w:r>
+        <w:t>url</w:t>
+      </w:r>
+      <w:proofErr w:type="spellEnd"/>
+      <w:r>
+        <w:t>(</w:t>
+      </w:r>
+      <w:proofErr w:type="gramEnd"/>
+      <w:r>
+        <w:t>)):</w:t>
+      </w:r>
+    </w:p>
+    <w:p>
+      <w:pPr>
+        <w:numPr>
+          <w:ilvl w:val="0"/>
+          <w:numId w:val="23"/>
+        </w:numPr>
+      </w:pPr>
+      <w:r>
+        <w:t xml:space="preserve">Si el usuario no existe → se crea </w:t>
+      </w:r>
+      <w:proofErr w:type="spellStart"/>
+      <w:r>
+        <w:t>User</w:t>
+      </w:r>
+      <w:proofErr w:type="spellEnd"/>
+      <w:r>
+        <w:t xml:space="preserve"> + Candidate o Company.</w:t>
+      </w:r>
+    </w:p>
+    <w:p>
+      <w:pPr>
+        <w:numPr>
+          <w:ilvl w:val="0"/>
+          <w:numId w:val="23"/>
+        </w:numPr>
+      </w:pPr>
+      <w:r>
+        <w:t>Si existe → se verifica contraseña y rol.</w:t>
+      </w:r>
+      <w:r>
+        <w:br/>
+        <w:t xml:space="preserve">• La respuesta del </w:t>
+      </w:r>
+      <w:proofErr w:type="spellStart"/>
+      <w:r>
+        <w:t>backend</w:t>
+      </w:r>
+      <w:proofErr w:type="spellEnd"/>
+      <w:r>
+        <w:t xml:space="preserve"> rellena:</w:t>
+      </w:r>
+    </w:p>
+    <w:p>
+      <w:pPr>
+        <w:numPr>
+          <w:ilvl w:val="0"/>
+          <w:numId w:val="23"/>
+        </w:numPr>
+      </w:pPr>
+      <w:proofErr w:type="spellStart"/>
+      <w:r>
+        <w:t>auth.is_authenticated</w:t>
+      </w:r>
+      <w:proofErr w:type="spellEnd"/>
+      <w:r>
+        <w:t xml:space="preserve"> = True</w:t>
+      </w:r>
+    </w:p>
+    <w:p>
+      <w:pPr>
+        <w:numPr>
+          <w:ilvl w:val="0"/>
+          <w:numId w:val="23"/>
+        </w:numPr>
+      </w:pPr>
+      <w:proofErr w:type="spellStart"/>
+      <w:r>
+        <w:t>auth.user_id</w:t>
+      </w:r>
+      <w:proofErr w:type="spellEnd"/>
+      <w:r>
+        <w:t xml:space="preserve">, </w:t>
+      </w:r>
+      <w:proofErr w:type="spellStart"/>
+      <w:proofErr w:type="gramStart"/>
+      <w:r>
+        <w:t>auth.email</w:t>
+      </w:r>
+      <w:proofErr w:type="spellEnd"/>
+      <w:proofErr w:type="gramEnd"/>
+    </w:p>
+    <w:p>
+      <w:pPr>
+        <w:numPr>
+          <w:ilvl w:val="0"/>
+          <w:numId w:val="23"/>
+        </w:numPr>
+      </w:pPr>
+      <w:r>
+        <w:t>role</w:t>
+      </w:r>
+    </w:p>
+    <w:p>
+      <w:pPr>
+        <w:numPr>
+          <w:ilvl w:val="0"/>
+          <w:numId w:val="23"/>
+        </w:numPr>
+      </w:pPr>
+      <w:proofErr w:type="spellStart"/>
+      <w:r>
+        <w:t>candidate_id</w:t>
+      </w:r>
+      <w:proofErr w:type="spellEnd"/>
+      <w:r>
+        <w:t xml:space="preserve"> o </w:t>
+      </w:r>
+      <w:proofErr w:type="spellStart"/>
+      <w:r>
+        <w:t>company_id</w:t>
+      </w:r>
+      <w:proofErr w:type="spellEnd"/>
+      <w:r>
+        <w:t xml:space="preserve"> según rol</w:t>
+      </w:r>
+    </w:p>
+    <w:p>
+      <w:r>
+        <w:t>Portal Candidato</w:t>
+      </w:r>
+      <w:r>
+        <w:br/>
+        <w:t xml:space="preserve">• </w:t>
+      </w:r>
+      <w:proofErr w:type="spellStart"/>
+      <w:r>
         <w:t>Dashboard</w:t>
       </w:r>
       <w:proofErr w:type="spellEnd"/>
@@ -1649,6 +2163,9 @@
       </w:r>
       <w:r>
         <w:br/>
+      </w:r>
+      <w:r>
+        <w:lastRenderedPageBreak/>
         <w:t>• Analítica de talento</w:t>
       </w:r>
       <w:r>
@@ -1749,7 +2266,7 @@
     </w:p>
     <w:p>
       <w:r>
-        <w:pict w14:anchorId="4177866F">
+        <w:pict w14:anchorId="4E81A884">
           <v:rect id="_x0000_i1133" style="width:0;height:1.5pt" o:hralign="center" o:hrstd="t" o:hr="t" fillcolor="#a0a0a0" stroked="f"/>
         </w:pict>
       </w:r>
@@ -1783,6 +2300,359 @@
     </w:p>
     <w:p>
       <w:r>
+        <w:rPr>
+          <w:rFonts w:ascii="Segoe UI Emoji" w:hAnsi="Segoe UI Emoji" w:cs="Segoe UI Emoji"/>
+        </w:rPr>
+        <w:t>🔐</w:t>
+      </w:r>
+      <w:r>
+        <w:t xml:space="preserve"> </w:t>
+      </w:r>
+      <w:proofErr w:type="spellStart"/>
+      <w:r>
+        <w:t>Auth</w:t>
+      </w:r>
+      <w:proofErr w:type="spellEnd"/>
+      <w:r>
+        <w:t xml:space="preserve"> (</w:t>
+      </w:r>
+      <w:proofErr w:type="spellStart"/>
+      <w:r>
+        <w:t>backend</w:t>
+      </w:r>
+      <w:proofErr w:type="spellEnd"/>
+      <w:r>
+        <w:t>/app/</w:t>
+      </w:r>
+      <w:proofErr w:type="spellStart"/>
+      <w:r>
+        <w:t>routers</w:t>
+      </w:r>
+      <w:proofErr w:type="spellEnd"/>
+      <w:r>
+        <w:t>/auth.py)</w:t>
+      </w:r>
+      <w:r>
+        <w:br/>
+        <w:t>• POST /</w:t>
+      </w:r>
+      <w:proofErr w:type="spellStart"/>
+      <w:r>
+        <w:t>auth</w:t>
+      </w:r>
+      <w:proofErr w:type="spellEnd"/>
+      <w:r>
+        <w:t>/</w:t>
+      </w:r>
+      <w:proofErr w:type="spellStart"/>
+      <w:r>
+        <w:t>login</w:t>
+      </w:r>
+      <w:proofErr w:type="spellEnd"/>
+    </w:p>
+    <w:p>
+      <w:r>
+        <w:t>Comportamiento:</w:t>
+      </w:r>
+      <w:r>
+        <w:br/>
+        <w:t>• Entrada:</w:t>
+      </w:r>
+    </w:p>
+    <w:p>
+      <w:proofErr w:type="gramStart"/>
+      <w:r>
+        <w:t>{ "</w:t>
+      </w:r>
+      <w:proofErr w:type="gramEnd"/>
+      <w:r>
+        <w:t>email": "...", "</w:t>
+      </w:r>
+      <w:proofErr w:type="spellStart"/>
+      <w:proofErr w:type="gramStart"/>
+      <w:r>
+        <w:t>password</w:t>
+      </w:r>
+      <w:proofErr w:type="spellEnd"/>
+      <w:proofErr w:type="gramEnd"/>
+      <w:r>
+        <w:t>": "...", "role": "candidate" | "</w:t>
+      </w:r>
+      <w:proofErr w:type="spellStart"/>
+      <w:r>
+        <w:t>company</w:t>
+      </w:r>
+      <w:proofErr w:type="spellEnd"/>
+      <w:proofErr w:type="gramStart"/>
+      <w:r>
+        <w:t>" }</w:t>
+      </w:r>
+      <w:proofErr w:type="gramEnd"/>
+    </w:p>
+    <w:p>
+      <w:r>
+        <w:t>• Si el usuario NO existe:</w:t>
+      </w:r>
+    </w:p>
+    <w:p>
+      <w:pPr>
+        <w:numPr>
+          <w:ilvl w:val="0"/>
+          <w:numId w:val="24"/>
+        </w:numPr>
+      </w:pPr>
+      <w:r>
+        <w:t xml:space="preserve">Crea </w:t>
+      </w:r>
+      <w:proofErr w:type="spellStart"/>
+      <w:proofErr w:type="gramStart"/>
+      <w:r>
+        <w:t>User</w:t>
+      </w:r>
+      <w:proofErr w:type="spellEnd"/>
+      <w:r>
+        <w:t>(</w:t>
+      </w:r>
+      <w:proofErr w:type="gramEnd"/>
+      <w:r>
+        <w:t xml:space="preserve">email, role, </w:t>
+      </w:r>
+      <w:proofErr w:type="spellStart"/>
+      <w:proofErr w:type="gramStart"/>
+      <w:r>
+        <w:t>password</w:t>
+      </w:r>
+      <w:proofErr w:type="gramEnd"/>
+      <w:r>
+        <w:t>_hash_bcrypt</w:t>
+      </w:r>
+      <w:proofErr w:type="spellEnd"/>
+      <w:r>
+        <w:t>)</w:t>
+      </w:r>
+    </w:p>
+    <w:p>
+      <w:pPr>
+        <w:numPr>
+          <w:ilvl w:val="0"/>
+          <w:numId w:val="24"/>
+        </w:numPr>
+      </w:pPr>
+      <w:r>
+        <w:t xml:space="preserve">Si role="candidate" → crea </w:t>
+      </w:r>
+      <w:proofErr w:type="gramStart"/>
+      <w:r>
+        <w:t>Candidate(</w:t>
+      </w:r>
+      <w:proofErr w:type="spellStart"/>
+      <w:proofErr w:type="gramEnd"/>
+      <w:r>
+        <w:t>user_id</w:t>
+      </w:r>
+      <w:proofErr w:type="spellEnd"/>
+      <w:r>
+        <w:t xml:space="preserve">=..., </w:t>
+      </w:r>
+      <w:proofErr w:type="spellStart"/>
+      <w:r>
+        <w:t>name</w:t>
+      </w:r>
+      <w:proofErr w:type="spellEnd"/>
+      <w:r>
+        <w:t>=</w:t>
+      </w:r>
+      <w:proofErr w:type="spellStart"/>
+      <w:r>
+        <w:t>None</w:t>
+      </w:r>
+      <w:proofErr w:type="spellEnd"/>
+      <w:r>
+        <w:t>)</w:t>
+      </w:r>
+    </w:p>
+    <w:p>
+      <w:pPr>
+        <w:numPr>
+          <w:ilvl w:val="0"/>
+          <w:numId w:val="24"/>
+        </w:numPr>
+      </w:pPr>
+      <w:r>
+        <w:t>Si role="</w:t>
+      </w:r>
+      <w:proofErr w:type="spellStart"/>
+      <w:r>
+        <w:t>company</w:t>
+      </w:r>
+      <w:proofErr w:type="spellEnd"/>
+      <w:r>
+        <w:t xml:space="preserve">" → crea </w:t>
+      </w:r>
+      <w:proofErr w:type="gramStart"/>
+      <w:r>
+        <w:t>Company(</w:t>
+      </w:r>
+      <w:proofErr w:type="spellStart"/>
+      <w:proofErr w:type="gramEnd"/>
+      <w:r>
+        <w:t>user_id</w:t>
+      </w:r>
+      <w:proofErr w:type="spellEnd"/>
+      <w:r>
+        <w:t xml:space="preserve">=..., </w:t>
+      </w:r>
+      <w:proofErr w:type="spellStart"/>
+      <w:r>
+        <w:t>name</w:t>
+      </w:r>
+      <w:proofErr w:type="spellEnd"/>
+      <w:r>
+        <w:t>=&lt;</w:t>
+      </w:r>
+      <w:proofErr w:type="spellStart"/>
+      <w:r>
+        <w:t>prefijo_email</w:t>
+      </w:r>
+      <w:proofErr w:type="spellEnd"/>
+      <w:r>
+        <w:t>&gt;)</w:t>
+      </w:r>
+      <w:r>
+        <w:br/>
+        <w:t>• Si el usuario SÍ existe:</w:t>
+      </w:r>
+    </w:p>
+    <w:p>
+      <w:pPr>
+        <w:numPr>
+          <w:ilvl w:val="0"/>
+          <w:numId w:val="24"/>
+        </w:numPr>
+      </w:pPr>
+      <w:r>
+        <w:t xml:space="preserve">Comprueba que </w:t>
+      </w:r>
+      <w:proofErr w:type="spellStart"/>
+      <w:proofErr w:type="gramStart"/>
+      <w:r>
+        <w:t>user.role</w:t>
+      </w:r>
+      <w:proofErr w:type="spellEnd"/>
+      <w:proofErr w:type="gramEnd"/>
+      <w:r>
+        <w:t xml:space="preserve"> == </w:t>
+      </w:r>
+      <w:proofErr w:type="spellStart"/>
+      <w:proofErr w:type="gramStart"/>
+      <w:r>
+        <w:t>payload.role</w:t>
+      </w:r>
+      <w:proofErr w:type="spellEnd"/>
+      <w:proofErr w:type="gramEnd"/>
+    </w:p>
+    <w:p>
+      <w:pPr>
+        <w:numPr>
+          <w:ilvl w:val="0"/>
+          <w:numId w:val="24"/>
+        </w:numPr>
+      </w:pPr>
+      <w:r>
+        <w:t xml:space="preserve">Si no tiene </w:t>
+      </w:r>
+      <w:proofErr w:type="spellStart"/>
+      <w:proofErr w:type="gramStart"/>
+      <w:r>
+        <w:t>password</w:t>
+      </w:r>
+      <w:proofErr w:type="gramEnd"/>
+      <w:r>
+        <w:t>_hash</w:t>
+      </w:r>
+      <w:proofErr w:type="spellEnd"/>
+      <w:r>
+        <w:t xml:space="preserve"> (usuarios antiguos) → la </w:t>
+      </w:r>
+      <w:proofErr w:type="spellStart"/>
+      <w:r>
+        <w:t>setea</w:t>
+      </w:r>
+      <w:proofErr w:type="spellEnd"/>
+      <w:r>
+        <w:t xml:space="preserve"> ahora</w:t>
+      </w:r>
+    </w:p>
+    <w:p>
+      <w:pPr>
+        <w:numPr>
+          <w:ilvl w:val="0"/>
+          <w:numId w:val="24"/>
+        </w:numPr>
+      </w:pPr>
+      <w:r>
+        <w:t>Si tiene hash → verifica contraseña (</w:t>
+      </w:r>
+      <w:proofErr w:type="spellStart"/>
+      <w:r>
+        <w:t>bcrypt</w:t>
+      </w:r>
+      <w:proofErr w:type="spellEnd"/>
+      <w:r>
+        <w:t>); si falla → 401</w:t>
+      </w:r>
+    </w:p>
+    <w:p>
+      <w:pPr>
+        <w:numPr>
+          <w:ilvl w:val="0"/>
+          <w:numId w:val="24"/>
+        </w:numPr>
+      </w:pPr>
+      <w:r>
+        <w:t>Asegura que exista Candidate o Company asociado (si falta, lo crea)</w:t>
+      </w:r>
+      <w:r>
+        <w:br/>
+        <w:t>• Devuelve:</w:t>
+      </w:r>
+    </w:p>
+    <w:p>
+      <w:pPr>
+        <w:numPr>
+          <w:ilvl w:val="0"/>
+          <w:numId w:val="24"/>
+        </w:numPr>
+      </w:pPr>
+      <w:proofErr w:type="spellStart"/>
+      <w:r>
+        <w:t>user_id</w:t>
+      </w:r>
+      <w:proofErr w:type="spellEnd"/>
+      <w:r>
+        <w:t xml:space="preserve">, email, role, </w:t>
+      </w:r>
+      <w:proofErr w:type="spellStart"/>
+      <w:r>
+        <w:t>candidate_id</w:t>
+      </w:r>
+      <w:proofErr w:type="spellEnd"/>
+      <w:r>
+        <w:t xml:space="preserve">?, </w:t>
+      </w:r>
+      <w:proofErr w:type="spellStart"/>
+      <w:proofErr w:type="gramStart"/>
+      <w:r>
+        <w:t>company_id</w:t>
+      </w:r>
+      <w:proofErr w:type="spellEnd"/>
+      <w:r>
+        <w:t>?</w:t>
+      </w:r>
+      <w:proofErr w:type="gramEnd"/>
+    </w:p>
+    <w:p>
+      <w:r>
         <w:t>Candidate</w:t>
       </w:r>
       <w:r>
@@ -1877,6 +2747,9 @@
       <w:proofErr w:type="spellEnd"/>
       <w:r>
         <w:br/>
+      </w:r>
+      <w:r>
+        <w:lastRenderedPageBreak/>
         <w:t>• GET /</w:t>
       </w:r>
       <w:proofErr w:type="spellStart"/>
@@ -2023,23 +2896,12 @@
       </w:r>
       <w:proofErr w:type="spellEnd"/>
       <w:r>
-        <w:t xml:space="preserve"> o reales según el estado del módulo), pero la </w:t>
-      </w:r>
-      <w:r>
-        <w:rPr>
-          <w:b/>
-          <w:bCs/>
-        </w:rPr>
-        <w:t>arquitectura y contratos deben respetarse</w:t>
-      </w:r>
-      <w:r>
-        <w:t>.</w:t>
-      </w:r>
-    </w:p>
-    <w:p>
-      <w:r>
-        <w:lastRenderedPageBreak/>
-        <w:pict w14:anchorId="216D36E7">
+        <w:t xml:space="preserve"> o reales según el estado del módulo), pero la arquitectura y contratos deben respetarse.</w:t>
+      </w:r>
+    </w:p>
+    <w:p>
+      <w:r>
+        <w:pict w14:anchorId="5F2A9C27">
           <v:rect id="_x0000_i1134" style="width:0;height:1.5pt" o:hralign="center" o:hrstd="t" o:hr="t" fillcolor="#a0a0a0" stroked="f"/>
         </w:pict>
       </w:r>
@@ -2091,22 +2953,22 @@
       <w:r>
         <w:t>/).</w:t>
       </w:r>
+    </w:p>
+    <w:p>
+      <w:r>
+        <w:t>Conectividad en Docker (</w:t>
+      </w:r>
+      <w:proofErr w:type="spellStart"/>
+      <w:r>
+        <w:t>backend</w:t>
+      </w:r>
+      <w:proofErr w:type="spellEnd"/>
+      <w:r>
+        <w:t>):</w:t>
+      </w:r>
       <w:r>
         <w:br/>
-        <w:t>Conectividad en Docker:</w:t>
-      </w:r>
-    </w:p>
-    <w:p>
-      <w:r>
-        <w:t>• DATABASE_URL interna (</w:t>
-      </w:r>
-      <w:proofErr w:type="spellStart"/>
-      <w:r>
-        <w:t>backend</w:t>
-      </w:r>
-      <w:proofErr w:type="spellEnd"/>
-      <w:r>
-        <w:t>):</w:t>
+        <w:t>• DATABASE_URL interna:</w:t>
       </w:r>
       <w:r>
         <w:br/>
@@ -2126,8 +2988,89 @@
         <w:t>users</w:t>
       </w:r>
       <w:proofErr w:type="spellEnd"/>
-      <w:r>
-        <w:br/>
+    </w:p>
+    <w:p>
+      <w:pPr>
+        <w:numPr>
+          <w:ilvl w:val="0"/>
+          <w:numId w:val="25"/>
+        </w:numPr>
+      </w:pPr>
+      <w:r>
+        <w:t xml:space="preserve">id, email, </w:t>
+      </w:r>
+      <w:proofErr w:type="spellStart"/>
+      <w:proofErr w:type="gramStart"/>
+      <w:r>
+        <w:t>password</w:t>
+      </w:r>
+      <w:proofErr w:type="gramEnd"/>
+      <w:r>
+        <w:t>_hash</w:t>
+      </w:r>
+      <w:proofErr w:type="spellEnd"/>
+      <w:r>
+        <w:t>, role (candidate/</w:t>
+      </w:r>
+      <w:proofErr w:type="spellStart"/>
+      <w:r>
+        <w:t>company</w:t>
+      </w:r>
+      <w:proofErr w:type="spellEnd"/>
+      <w:r>
+        <w:t xml:space="preserve">), </w:t>
+      </w:r>
+      <w:proofErr w:type="spellStart"/>
+      <w:r>
+        <w:t>last_login_at</w:t>
+      </w:r>
+      <w:proofErr w:type="spellEnd"/>
+      <w:r>
+        <w:t xml:space="preserve">, </w:t>
+      </w:r>
+      <w:proofErr w:type="spellStart"/>
+      <w:r>
+        <w:t>timestamps</w:t>
+      </w:r>
+      <w:proofErr w:type="spellEnd"/>
+    </w:p>
+    <w:p>
+      <w:pPr>
+        <w:numPr>
+          <w:ilvl w:val="0"/>
+          <w:numId w:val="25"/>
+        </w:numPr>
+      </w:pPr>
+      <w:r>
+        <w:t>Relaciones: candidate (</w:t>
+      </w:r>
+      <w:proofErr w:type="spellStart"/>
+      <w:r>
+        <w:t>OneToOne</w:t>
+      </w:r>
+      <w:proofErr w:type="spellEnd"/>
+      <w:r>
+        <w:t xml:space="preserve">), </w:t>
+      </w:r>
+      <w:proofErr w:type="spellStart"/>
+      <w:r>
+        <w:t>company</w:t>
+      </w:r>
+      <w:proofErr w:type="spellEnd"/>
+      <w:r>
+        <w:t xml:space="preserve"> (</w:t>
+      </w:r>
+      <w:proofErr w:type="spellStart"/>
+      <w:r>
+        <w:t>OneToOne</w:t>
+      </w:r>
+      <w:proofErr w:type="spellEnd"/>
+      <w:r>
+        <w:t>)</w:t>
+      </w:r>
+    </w:p>
+    <w:p>
+      <w:r>
         <w:t>• candidates</w:t>
       </w:r>
       <w:r>
@@ -2159,13 +3102,65 @@
       <w:r>
         <w:t>)</w:t>
       </w:r>
+    </w:p>
+    <w:p>
+      <w:r>
+        <w:t xml:space="preserve">• </w:t>
+      </w:r>
+      <w:proofErr w:type="spellStart"/>
+      <w:r>
+        <w:t>companies</w:t>
+      </w:r>
+      <w:proofErr w:type="spellEnd"/>
+    </w:p>
+    <w:p>
+      <w:pPr>
+        <w:numPr>
+          <w:ilvl w:val="0"/>
+          <w:numId w:val="26"/>
+        </w:numPr>
+      </w:pPr>
+      <w:proofErr w:type="spellStart"/>
+      <w:r>
+        <w:t>name</w:t>
+      </w:r>
+      <w:proofErr w:type="spellEnd"/>
+      <w:r>
+        <w:t xml:space="preserve"> es NOT NULL en BD → cuando se crea una empresa automáticamente desde /</w:t>
+      </w:r>
+      <w:proofErr w:type="spellStart"/>
+      <w:r>
+        <w:t>auth</w:t>
+      </w:r>
+      <w:proofErr w:type="spellEnd"/>
+      <w:r>
+        <w:t>/</w:t>
+      </w:r>
+      <w:proofErr w:type="spellStart"/>
+      <w:r>
+        <w:t>login</w:t>
+      </w:r>
+      <w:proofErr w:type="spellEnd"/>
+      <w:r>
+        <w:t>, se usa el prefijo del email como nombre por defecto.</w:t>
+      </w:r>
       <w:r>
         <w:br/>
         <w:t xml:space="preserve">• </w:t>
       </w:r>
       <w:proofErr w:type="spellStart"/>
       <w:r>
-        <w:t>companies</w:t>
+        <w:t>company_culture</w:t>
+      </w:r>
+      <w:proofErr w:type="spellEnd"/>
+    </w:p>
+    <w:p>
+      <w:r>
+        <w:t xml:space="preserve">• </w:t>
+      </w:r>
+      <w:proofErr w:type="spellStart"/>
+      <w:r>
+        <w:t>jobs</w:t>
       </w:r>
       <w:proofErr w:type="spellEnd"/>
       <w:r>
@@ -2174,16 +3169,35 @@
       </w:r>
       <w:proofErr w:type="spellStart"/>
       <w:r>
-        <w:t>company_culture</w:t>
-      </w:r>
-      <w:proofErr w:type="spellEnd"/>
+        <w:t>job_skills</w:t>
+      </w:r>
+      <w:proofErr w:type="spellEnd"/>
+      <w:r>
+        <w:t xml:space="preserve"> (</w:t>
+      </w:r>
+      <w:proofErr w:type="spellStart"/>
+      <w:r>
+        <w:t>Must</w:t>
+      </w:r>
+      <w:proofErr w:type="spellEnd"/>
+      <w:r>
+        <w:t>/</w:t>
+      </w:r>
+      <w:proofErr w:type="spellStart"/>
+      <w:r>
+        <w:t>Nice</w:t>
+      </w:r>
+      <w:proofErr w:type="spellEnd"/>
+      <w:r>
+        <w:t>)</w:t>
+      </w:r>
       <w:r>
         <w:br/>
         <w:t xml:space="preserve">• </w:t>
       </w:r>
       <w:proofErr w:type="spellStart"/>
       <w:r>
-        <w:t>jobs</w:t>
+        <w:t>team_profiles</w:t>
       </w:r>
       <w:proofErr w:type="spellEnd"/>
       <w:r>
@@ -2192,35 +3206,28 @@
       </w:r>
       <w:proofErr w:type="spellStart"/>
       <w:r>
-        <w:t>job_skills</w:t>
-      </w:r>
-      <w:proofErr w:type="spellEnd"/>
-      <w:r>
-        <w:t xml:space="preserve"> (</w:t>
-      </w:r>
-      <w:proofErr w:type="spellStart"/>
-      <w:r>
-        <w:t>Must</w:t>
-      </w:r>
-      <w:proofErr w:type="spellEnd"/>
-      <w:r>
-        <w:t>/</w:t>
-      </w:r>
-      <w:proofErr w:type="spellStart"/>
-      <w:r>
-        <w:t>Nice</w:t>
-      </w:r>
-      <w:proofErr w:type="spellEnd"/>
-      <w:r>
-        <w:t>)</w:t>
-      </w:r>
+        <w:t>team_members</w:t>
+      </w:r>
+      <w:proofErr w:type="spellEnd"/>
+      <w:r>
+        <w:br/>
+      </w:r>
+      <w:r>
+        <w:lastRenderedPageBreak/>
+        <w:t xml:space="preserve">• </w:t>
+      </w:r>
+      <w:proofErr w:type="spellStart"/>
+      <w:r>
+        <w:t>applications</w:t>
+      </w:r>
+      <w:proofErr w:type="spellEnd"/>
       <w:r>
         <w:br/>
         <w:t xml:space="preserve">• </w:t>
       </w:r>
       <w:proofErr w:type="spellStart"/>
       <w:r>
-        <w:t>team_profiles</w:t>
+        <w:t>job_recommendations</w:t>
       </w:r>
       <w:proofErr w:type="spellEnd"/>
       <w:r>
@@ -2229,33 +3236,6 @@
       </w:r>
       <w:proofErr w:type="spellStart"/>
       <w:r>
-        <w:t>team_members</w:t>
-      </w:r>
-      <w:proofErr w:type="spellEnd"/>
-      <w:r>
-        <w:br/>
-        <w:t xml:space="preserve">• </w:t>
-      </w:r>
-      <w:proofErr w:type="spellStart"/>
-      <w:r>
-        <w:t>applications</w:t>
-      </w:r>
-      <w:proofErr w:type="spellEnd"/>
-      <w:r>
-        <w:br/>
-        <w:t xml:space="preserve">• </w:t>
-      </w:r>
-      <w:proofErr w:type="spellStart"/>
-      <w:r>
-        <w:t>job_recommendations</w:t>
-      </w:r>
-      <w:proofErr w:type="spellEnd"/>
-      <w:r>
-        <w:br/>
-        <w:t xml:space="preserve">• </w:t>
-      </w:r>
-      <w:proofErr w:type="spellStart"/>
-      <w:r>
         <w:t>co_teaching_pairs</w:t>
       </w:r>
       <w:proofErr w:type="spellEnd"/>
@@ -2296,7 +3276,7 @@
     </w:p>
     <w:p>
       <w:r>
-        <w:pict w14:anchorId="75E008F1">
+        <w:pict w14:anchorId="00B579F6">
           <v:rect id="_x0000_i1135" style="width:0;height:1.5pt" o:hralign="center" o:hrstd="t" o:hr="t" fillcolor="#a0a0a0" stroked="f"/>
         </w:pict>
       </w:r>
@@ -2337,7 +3317,7 @@
       <w:pPr>
         <w:numPr>
           <w:ilvl w:val="0"/>
-          <w:numId w:val="18"/>
+          <w:numId w:val="27"/>
         </w:numPr>
       </w:pPr>
       <w:r>
@@ -2385,7 +3365,7 @@
       <w:pPr>
         <w:numPr>
           <w:ilvl w:val="0"/>
-          <w:numId w:val="19"/>
+          <w:numId w:val="28"/>
         </w:numPr>
       </w:pPr>
       <w:r>
@@ -2407,6 +3387,70 @@
       <w:r>
         <w:t>)</w:t>
       </w:r>
+    </w:p>
+    <w:p>
+      <w:pPr>
+        <w:numPr>
+          <w:ilvl w:val="0"/>
+          <w:numId w:val="28"/>
+        </w:numPr>
+      </w:pPr>
+      <w:r>
+        <w:t>requirements.txt incluye seguridad/autenticación:</w:t>
+      </w:r>
+    </w:p>
+    <w:p>
+      <w:pPr>
+        <w:numPr>
+          <w:ilvl w:val="1"/>
+          <w:numId w:val="28"/>
+        </w:numPr>
+      </w:pPr>
+      <w:proofErr w:type="spellStart"/>
+      <w:r>
+        <w:t>passlib</w:t>
+      </w:r>
+      <w:proofErr w:type="spellEnd"/>
+      <w:r>
+        <w:t>[</w:t>
+      </w:r>
+      <w:proofErr w:type="spellStart"/>
+      <w:r>
+        <w:t>bcrypt</w:t>
+      </w:r>
+      <w:proofErr w:type="spellEnd"/>
+      <w:r>
+        <w:t>]</w:t>
+      </w:r>
+    </w:p>
+    <w:p>
+      <w:pPr>
+        <w:numPr>
+          <w:ilvl w:val="1"/>
+          <w:numId w:val="28"/>
+        </w:numPr>
+      </w:pPr>
+      <w:proofErr w:type="spellStart"/>
+      <w:r>
+        <w:t>bcrypt</w:t>
+      </w:r>
+      <w:proofErr w:type="spellEnd"/>
+    </w:p>
+    <w:p>
+      <w:pPr>
+        <w:numPr>
+          <w:ilvl w:val="1"/>
+          <w:numId w:val="28"/>
+        </w:numPr>
+      </w:pPr>
+      <w:r>
+        <w:t>email-</w:t>
+      </w:r>
+      <w:proofErr w:type="spellStart"/>
+      <w:r>
+        <w:t>validator</w:t>
+      </w:r>
+      <w:proofErr w:type="spellEnd"/>
     </w:p>
     <w:p>
       <w:r>
@@ -2497,7 +3541,7 @@
     </w:p>
     <w:p>
       <w:r>
-        <w:pict w14:anchorId="2EC3FB44">
+        <w:pict w14:anchorId="4D147429">
           <v:rect id="_x0000_i1136" style="width:0;height:1.5pt" o:hralign="center" o:hrstd="t" o:hr="t" fillcolor="#a0a0a0" stroked="f"/>
         </w:pict>
       </w:r>
@@ -2515,7 +3559,6 @@
     </w:p>
     <w:p>
       <w:r>
-        <w:lastRenderedPageBreak/>
         <w:t xml:space="preserve">• Miguel → arquitectura, </w:t>
       </w:r>
       <w:proofErr w:type="spellStart"/>
@@ -2603,7 +3646,7 @@
     </w:p>
     <w:p>
       <w:r>
-        <w:pict w14:anchorId="2F8B20F8">
+        <w:pict w14:anchorId="24B91FAA">
           <v:rect id="_x0000_i1137" style="width:0;height:1.5pt" o:hralign="center" o:hrstd="t" o:hr="t" fillcolor="#a0a0a0" stroked="f"/>
         </w:pict>
       </w:r>
@@ -2627,8 +3670,10 @@
         <w:br/>
         <w:t>Cualquier nuevo código debe integrarse sin romper esta estructura ni cambiar nombres.</w:t>
       </w:r>
-      <w:r>
-        <w:br/>
+    </w:p>
+    <w:p>
+      <w:r>
+        <w:lastRenderedPageBreak/>
         <w:t xml:space="preserve">El </w:t>
       </w:r>
       <w:proofErr w:type="spellStart"/>
@@ -2671,10 +3716,69 @@
       </w:r>
       <w:proofErr w:type="spellEnd"/>
       <w:r>
+        <w:t xml:space="preserve"> y debe hacer </w:t>
+      </w:r>
+      <w:proofErr w:type="spellStart"/>
+      <w:r>
+        <w:t>login</w:t>
+      </w:r>
+      <w:proofErr w:type="spellEnd"/>
+      <w:r>
+        <w:t xml:space="preserve"> vía POST /</w:t>
+      </w:r>
+      <w:proofErr w:type="spellStart"/>
+      <w:r>
+        <w:t>auth</w:t>
+      </w:r>
+      <w:proofErr w:type="spellEnd"/>
+      <w:r>
+        <w:t>/</w:t>
+      </w:r>
+      <w:proofErr w:type="spellStart"/>
+      <w:r>
+        <w:t>login</w:t>
+      </w:r>
+      <w:proofErr w:type="spellEnd"/>
+      <w:r>
+        <w:t xml:space="preserve"> rellenando correctamente </w:t>
+      </w:r>
+      <w:proofErr w:type="spellStart"/>
+      <w:proofErr w:type="gramStart"/>
+      <w:r>
+        <w:t>st.session</w:t>
+      </w:r>
+      <w:proofErr w:type="gramEnd"/>
+      <w:r>
+        <w:t>_</w:t>
+      </w:r>
+      <w:proofErr w:type="gramStart"/>
+      <w:r>
+        <w:t>state.auth</w:t>
+      </w:r>
+      <w:proofErr w:type="spellEnd"/>
+      <w:proofErr w:type="gramEnd"/>
+      <w:r>
+        <w:t xml:space="preserve">, role, </w:t>
+      </w:r>
+      <w:proofErr w:type="spellStart"/>
+      <w:r>
+        <w:t>candidate_id</w:t>
+      </w:r>
+      <w:proofErr w:type="spellEnd"/>
+      <w:r>
+        <w:t xml:space="preserve"> y </w:t>
+      </w:r>
+      <w:proofErr w:type="spellStart"/>
+      <w:r>
+        <w:t>company_id</w:t>
+      </w:r>
+      <w:proofErr w:type="spellEnd"/>
+      <w:r>
         <w:t>.</w:t>
       </w:r>
-      <w:r>
-        <w:br/>
+    </w:p>
+    <w:p>
+      <w:r>
         <w:t xml:space="preserve">El </w:t>
       </w:r>
       <w:proofErr w:type="spellStart"/>
@@ -2715,12 +3819,12 @@
       </w:r>
       <w:proofErr w:type="spellEnd"/>
       <w:r>
-        <w:t>/.</w:t>
-      </w:r>
-    </w:p>
-    <w:p>
-      <w:r>
-        <w:pict w14:anchorId="077C8597">
+        <w:t>/ y el flujo de autenticación descrito arriba.</w:t>
+      </w:r>
+    </w:p>
+    <w:p>
+      <w:r>
+        <w:pict w14:anchorId="6D0088BC">
           <v:rect id="_x0000_i1138" style="width:0;height:1.5pt" o:hralign="center" o:hrstd="t" o:hr="t" fillcolor="#a0a0a0" stroked="f"/>
         </w:pict>
       </w:r>
@@ -2769,7 +3873,7 @@
     </w:p>
     <w:p>
       <w:r>
-        <w:pict w14:anchorId="4F1DADDF">
+        <w:pict w14:anchorId="488A752E">
           <v:rect id="_x0000_i1139" style="width:0;height:1.5pt" o:hralign="center" o:hrstd="t" o:hr="t" fillcolor="#a0a0a0" stroked="f"/>
         </w:pict>
       </w:r>
@@ -2788,6 +3892,602 @@
 <file path=word/numbering.xml><?xml version="1.0" encoding="utf-8"?>
 <w:numbering xmlns:wpc="http://schemas.microsoft.com/office/word/2010/wordprocessingCanvas" xmlns:cx="http://schemas.microsoft.com/office/drawing/2014/chartex" xmlns:cx1="http://schemas.microsoft.com/office/drawing/2015/9/8/chartex" xmlns:cx2="http://schemas.microsoft.com/office/drawing/2015/10/21/chartex" xmlns:cx3="http://schemas.microsoft.com/office/drawing/2016/5/9/chartex" xmlns:cx4="http://schemas.microsoft.com/office/drawing/2016/5/10/chartex" xmlns:cx5="http://schemas.microsoft.com/office/drawing/2016/5/11/chartex" xmlns:cx6="http://schemas.microsoft.com/office/drawing/2016/5/12/chartex" xmlns:cx7="http://schemas.microsoft.com/office/drawing/2016/5/13/chartex" xmlns:cx8="http://schemas.microsoft.com/office/drawing/2016/5/14/chartex" xmlns:mc="http://schemas.openxmlformats.org/markup-compatibility/2006" xmlns:aink="http://schemas.microsoft.com/office/drawing/2016/ink" xmlns:am3d="http://schemas.microsoft.com/office/drawing/2017/model3d" xmlns:o="urn:schemas-microsoft-com:office:office" xmlns:oel="http://schemas.microsoft.com/office/2019/extlst" xmlns:r="http://schemas.openxmlformats.org/officeDocument/2006/relationships" xmlns:m="http://schemas.openxmlformats.org/officeDocument/2006/math" xmlns:v="urn:schemas-microsoft-com:vml" xmlns:wp14="http://schemas.microsoft.com/office/word/2010/wordprocessingDrawing" xmlns:wp="http://schemas.openxmlformats.org/drawingml/2006/wordprocessingDrawing" xmlns:w10="urn:schemas-microsoft-com:office:word" xmlns:w="http://schemas.openxmlformats.org/wordprocessingml/2006/main" xmlns:w14="http://schemas.microsoft.com/office/word/2010/wordml" xmlns:w15="http://schemas.microsoft.com/office/word/2012/wordml" xmlns:w16cex="http://schemas.microsoft.com/office/word/2018/wordml/cex" xmlns:w16cid="http://schemas.microsoft.com/office/word/2016/wordml/cid" xmlns:w16="http://schemas.microsoft.com/office/word/2018/wordml" xmlns:w16du="http://schemas.microsoft.com/office/word/2023/wordml/word16du" xmlns:w16sdtdh="http://schemas.microsoft.com/office/word/2020/wordml/sdtdatahash" xmlns:w16sdtfl="http://schemas.microsoft.com/office/word/2024/wordml/sdtformatlock" xmlns:w16se="http://schemas.microsoft.com/office/word/2015/wordml/symex" xmlns:wpg="http://schemas.microsoft.com/office/word/2010/wordprocessingGroup" xmlns:wpi="http://schemas.microsoft.com/office/word/2010/wordprocessingInk" xmlns:wne="http://schemas.microsoft.com/office/word/2006/wordml" xmlns:wps="http://schemas.microsoft.com/office/word/2010/wordprocessingShape" mc:Ignorable="w14 w15 w16se w16cid w16 w16cex w16sdtdh w16sdtfl w16du wp14">
   <w:abstractNum w:abstractNumId="0" w15:restartNumberingAfterBreak="0">
+    <w:nsid w:val="01A72166"/>
+    <w:multiLevelType w:val="multilevel"/>
+    <w:tmpl w:val="E9F27BA6"/>
+    <w:lvl w:ilvl="0">
+      <w:start w:val="1"/>
+      <w:numFmt w:val="bullet"/>
+      <w:lvlText w:val=""/>
+      <w:lvlJc w:val="left"/>
+      <w:pPr>
+        <w:tabs>
+          <w:tab w:val="num" w:pos="720"/>
+        </w:tabs>
+        <w:ind w:left="720" w:hanging="360"/>
+      </w:pPr>
+      <w:rPr>
+        <w:rFonts w:ascii="Symbol" w:hAnsi="Symbol" w:hint="default"/>
+        <w:sz w:val="20"/>
+      </w:rPr>
+    </w:lvl>
+    <w:lvl w:ilvl="1" w:tentative="1">
+      <w:start w:val="1"/>
+      <w:numFmt w:val="bullet"/>
+      <w:lvlText w:val="o"/>
+      <w:lvlJc w:val="left"/>
+      <w:pPr>
+        <w:tabs>
+          <w:tab w:val="num" w:pos="1440"/>
+        </w:tabs>
+        <w:ind w:left="1440" w:hanging="360"/>
+      </w:pPr>
+      <w:rPr>
+        <w:rFonts w:ascii="Courier New" w:hAnsi="Courier New" w:hint="default"/>
+        <w:sz w:val="20"/>
+      </w:rPr>
+    </w:lvl>
+    <w:lvl w:ilvl="2" w:tentative="1">
+      <w:start w:val="1"/>
+      <w:numFmt w:val="bullet"/>
+      <w:lvlText w:val=""/>
+      <w:lvlJc w:val="left"/>
+      <w:pPr>
+        <w:tabs>
+          <w:tab w:val="num" w:pos="2160"/>
+        </w:tabs>
+        <w:ind w:left="2160" w:hanging="360"/>
+      </w:pPr>
+      <w:rPr>
+        <w:rFonts w:ascii="Wingdings" w:hAnsi="Wingdings" w:hint="default"/>
+        <w:sz w:val="20"/>
+      </w:rPr>
+    </w:lvl>
+    <w:lvl w:ilvl="3" w:tentative="1">
+      <w:start w:val="1"/>
+      <w:numFmt w:val="bullet"/>
+      <w:lvlText w:val=""/>
+      <w:lvlJc w:val="left"/>
+      <w:pPr>
+        <w:tabs>
+          <w:tab w:val="num" w:pos="2880"/>
+        </w:tabs>
+        <w:ind w:left="2880" w:hanging="360"/>
+      </w:pPr>
+      <w:rPr>
+        <w:rFonts w:ascii="Wingdings" w:hAnsi="Wingdings" w:hint="default"/>
+        <w:sz w:val="20"/>
+      </w:rPr>
+    </w:lvl>
+    <w:lvl w:ilvl="4" w:tentative="1">
+      <w:start w:val="1"/>
+      <w:numFmt w:val="bullet"/>
+      <w:lvlText w:val=""/>
+      <w:lvlJc w:val="left"/>
+      <w:pPr>
+        <w:tabs>
+          <w:tab w:val="num" w:pos="3600"/>
+        </w:tabs>
+        <w:ind w:left="3600" w:hanging="360"/>
+      </w:pPr>
+      <w:rPr>
+        <w:rFonts w:ascii="Wingdings" w:hAnsi="Wingdings" w:hint="default"/>
+        <w:sz w:val="20"/>
+      </w:rPr>
+    </w:lvl>
+    <w:lvl w:ilvl="5" w:tentative="1">
+      <w:start w:val="1"/>
+      <w:numFmt w:val="bullet"/>
+      <w:lvlText w:val=""/>
+      <w:lvlJc w:val="left"/>
+      <w:pPr>
+        <w:tabs>
+          <w:tab w:val="num" w:pos="4320"/>
+        </w:tabs>
+        <w:ind w:left="4320" w:hanging="360"/>
+      </w:pPr>
+      <w:rPr>
+        <w:rFonts w:ascii="Wingdings" w:hAnsi="Wingdings" w:hint="default"/>
+        <w:sz w:val="20"/>
+      </w:rPr>
+    </w:lvl>
+    <w:lvl w:ilvl="6" w:tentative="1">
+      <w:start w:val="1"/>
+      <w:numFmt w:val="bullet"/>
+      <w:lvlText w:val=""/>
+      <w:lvlJc w:val="left"/>
+      <w:pPr>
+        <w:tabs>
+          <w:tab w:val="num" w:pos="5040"/>
+        </w:tabs>
+        <w:ind w:left="5040" w:hanging="360"/>
+      </w:pPr>
+      <w:rPr>
+        <w:rFonts w:ascii="Wingdings" w:hAnsi="Wingdings" w:hint="default"/>
+        <w:sz w:val="20"/>
+      </w:rPr>
+    </w:lvl>
+    <w:lvl w:ilvl="7" w:tentative="1">
+      <w:start w:val="1"/>
+      <w:numFmt w:val="bullet"/>
+      <w:lvlText w:val=""/>
+      <w:lvlJc w:val="left"/>
+      <w:pPr>
+        <w:tabs>
+          <w:tab w:val="num" w:pos="5760"/>
+        </w:tabs>
+        <w:ind w:left="5760" w:hanging="360"/>
+      </w:pPr>
+      <w:rPr>
+        <w:rFonts w:ascii="Wingdings" w:hAnsi="Wingdings" w:hint="default"/>
+        <w:sz w:val="20"/>
+      </w:rPr>
+    </w:lvl>
+    <w:lvl w:ilvl="8" w:tentative="1">
+      <w:start w:val="1"/>
+      <w:numFmt w:val="bullet"/>
+      <w:lvlText w:val=""/>
+      <w:lvlJc w:val="left"/>
+      <w:pPr>
+        <w:tabs>
+          <w:tab w:val="num" w:pos="6480"/>
+        </w:tabs>
+        <w:ind w:left="6480" w:hanging="360"/>
+      </w:pPr>
+      <w:rPr>
+        <w:rFonts w:ascii="Wingdings" w:hAnsi="Wingdings" w:hint="default"/>
+        <w:sz w:val="20"/>
+      </w:rPr>
+    </w:lvl>
+  </w:abstractNum>
+  <w:abstractNum w:abstractNumId="1" w15:restartNumberingAfterBreak="0">
+    <w:nsid w:val="04E3395C"/>
+    <w:multiLevelType w:val="multilevel"/>
+    <w:tmpl w:val="75DA8BBA"/>
+    <w:lvl w:ilvl="0">
+      <w:start w:val="1"/>
+      <w:numFmt w:val="bullet"/>
+      <w:lvlText w:val=""/>
+      <w:lvlJc w:val="left"/>
+      <w:pPr>
+        <w:tabs>
+          <w:tab w:val="num" w:pos="720"/>
+        </w:tabs>
+        <w:ind w:left="720" w:hanging="360"/>
+      </w:pPr>
+      <w:rPr>
+        <w:rFonts w:ascii="Symbol" w:hAnsi="Symbol" w:hint="default"/>
+        <w:sz w:val="20"/>
+      </w:rPr>
+    </w:lvl>
+    <w:lvl w:ilvl="1">
+      <w:start w:val="1"/>
+      <w:numFmt w:val="bullet"/>
+      <w:lvlText w:val="o"/>
+      <w:lvlJc w:val="left"/>
+      <w:pPr>
+        <w:tabs>
+          <w:tab w:val="num" w:pos="1440"/>
+        </w:tabs>
+        <w:ind w:left="1440" w:hanging="360"/>
+      </w:pPr>
+      <w:rPr>
+        <w:rFonts w:ascii="Courier New" w:hAnsi="Courier New" w:hint="default"/>
+        <w:sz w:val="20"/>
+      </w:rPr>
+    </w:lvl>
+    <w:lvl w:ilvl="2" w:tentative="1">
+      <w:start w:val="1"/>
+      <w:numFmt w:val="bullet"/>
+      <w:lvlText w:val=""/>
+      <w:lvlJc w:val="left"/>
+      <w:pPr>
+        <w:tabs>
+          <w:tab w:val="num" w:pos="2160"/>
+        </w:tabs>
+        <w:ind w:left="2160" w:hanging="360"/>
+      </w:pPr>
+      <w:rPr>
+        <w:rFonts w:ascii="Wingdings" w:hAnsi="Wingdings" w:hint="default"/>
+        <w:sz w:val="20"/>
+      </w:rPr>
+    </w:lvl>
+    <w:lvl w:ilvl="3" w:tentative="1">
+      <w:start w:val="1"/>
+      <w:numFmt w:val="bullet"/>
+      <w:lvlText w:val=""/>
+      <w:lvlJc w:val="left"/>
+      <w:pPr>
+        <w:tabs>
+          <w:tab w:val="num" w:pos="2880"/>
+        </w:tabs>
+        <w:ind w:left="2880" w:hanging="360"/>
+      </w:pPr>
+      <w:rPr>
+        <w:rFonts w:ascii="Wingdings" w:hAnsi="Wingdings" w:hint="default"/>
+        <w:sz w:val="20"/>
+      </w:rPr>
+    </w:lvl>
+    <w:lvl w:ilvl="4" w:tentative="1">
+      <w:start w:val="1"/>
+      <w:numFmt w:val="bullet"/>
+      <w:lvlText w:val=""/>
+      <w:lvlJc w:val="left"/>
+      <w:pPr>
+        <w:tabs>
+          <w:tab w:val="num" w:pos="3600"/>
+        </w:tabs>
+        <w:ind w:left="3600" w:hanging="360"/>
+      </w:pPr>
+      <w:rPr>
+        <w:rFonts w:ascii="Wingdings" w:hAnsi="Wingdings" w:hint="default"/>
+        <w:sz w:val="20"/>
+      </w:rPr>
+    </w:lvl>
+    <w:lvl w:ilvl="5" w:tentative="1">
+      <w:start w:val="1"/>
+      <w:numFmt w:val="bullet"/>
+      <w:lvlText w:val=""/>
+      <w:lvlJc w:val="left"/>
+      <w:pPr>
+        <w:tabs>
+          <w:tab w:val="num" w:pos="4320"/>
+        </w:tabs>
+        <w:ind w:left="4320" w:hanging="360"/>
+      </w:pPr>
+      <w:rPr>
+        <w:rFonts w:ascii="Wingdings" w:hAnsi="Wingdings" w:hint="default"/>
+        <w:sz w:val="20"/>
+      </w:rPr>
+    </w:lvl>
+    <w:lvl w:ilvl="6" w:tentative="1">
+      <w:start w:val="1"/>
+      <w:numFmt w:val="bullet"/>
+      <w:lvlText w:val=""/>
+      <w:lvlJc w:val="left"/>
+      <w:pPr>
+        <w:tabs>
+          <w:tab w:val="num" w:pos="5040"/>
+        </w:tabs>
+        <w:ind w:left="5040" w:hanging="360"/>
+      </w:pPr>
+      <w:rPr>
+        <w:rFonts w:ascii="Wingdings" w:hAnsi="Wingdings" w:hint="default"/>
+        <w:sz w:val="20"/>
+      </w:rPr>
+    </w:lvl>
+    <w:lvl w:ilvl="7" w:tentative="1">
+      <w:start w:val="1"/>
+      <w:numFmt w:val="bullet"/>
+      <w:lvlText w:val=""/>
+      <w:lvlJc w:val="left"/>
+      <w:pPr>
+        <w:tabs>
+          <w:tab w:val="num" w:pos="5760"/>
+        </w:tabs>
+        <w:ind w:left="5760" w:hanging="360"/>
+      </w:pPr>
+      <w:rPr>
+        <w:rFonts w:ascii="Wingdings" w:hAnsi="Wingdings" w:hint="default"/>
+        <w:sz w:val="20"/>
+      </w:rPr>
+    </w:lvl>
+    <w:lvl w:ilvl="8" w:tentative="1">
+      <w:start w:val="1"/>
+      <w:numFmt w:val="bullet"/>
+      <w:lvlText w:val=""/>
+      <w:lvlJc w:val="left"/>
+      <w:pPr>
+        <w:tabs>
+          <w:tab w:val="num" w:pos="6480"/>
+        </w:tabs>
+        <w:ind w:left="6480" w:hanging="360"/>
+      </w:pPr>
+      <w:rPr>
+        <w:rFonts w:ascii="Wingdings" w:hAnsi="Wingdings" w:hint="default"/>
+        <w:sz w:val="20"/>
+      </w:rPr>
+    </w:lvl>
+  </w:abstractNum>
+  <w:abstractNum w:abstractNumId="2" w15:restartNumberingAfterBreak="0">
+    <w:nsid w:val="11CE4B54"/>
+    <w:multiLevelType w:val="multilevel"/>
+    <w:tmpl w:val="2D7C3DD8"/>
+    <w:lvl w:ilvl="0">
+      <w:start w:val="1"/>
+      <w:numFmt w:val="bullet"/>
+      <w:lvlText w:val=""/>
+      <w:lvlJc w:val="left"/>
+      <w:pPr>
+        <w:tabs>
+          <w:tab w:val="num" w:pos="720"/>
+        </w:tabs>
+        <w:ind w:left="720" w:hanging="360"/>
+      </w:pPr>
+      <w:rPr>
+        <w:rFonts w:ascii="Symbol" w:hAnsi="Symbol" w:hint="default"/>
+        <w:sz w:val="20"/>
+      </w:rPr>
+    </w:lvl>
+    <w:lvl w:ilvl="1" w:tentative="1">
+      <w:start w:val="1"/>
+      <w:numFmt w:val="bullet"/>
+      <w:lvlText w:val="o"/>
+      <w:lvlJc w:val="left"/>
+      <w:pPr>
+        <w:tabs>
+          <w:tab w:val="num" w:pos="1440"/>
+        </w:tabs>
+        <w:ind w:left="1440" w:hanging="360"/>
+      </w:pPr>
+      <w:rPr>
+        <w:rFonts w:ascii="Courier New" w:hAnsi="Courier New" w:hint="default"/>
+        <w:sz w:val="20"/>
+      </w:rPr>
+    </w:lvl>
+    <w:lvl w:ilvl="2" w:tentative="1">
+      <w:start w:val="1"/>
+      <w:numFmt w:val="bullet"/>
+      <w:lvlText w:val=""/>
+      <w:lvlJc w:val="left"/>
+      <w:pPr>
+        <w:tabs>
+          <w:tab w:val="num" w:pos="2160"/>
+        </w:tabs>
+        <w:ind w:left="2160" w:hanging="360"/>
+      </w:pPr>
+      <w:rPr>
+        <w:rFonts w:ascii="Wingdings" w:hAnsi="Wingdings" w:hint="default"/>
+        <w:sz w:val="20"/>
+      </w:rPr>
+    </w:lvl>
+    <w:lvl w:ilvl="3" w:tentative="1">
+      <w:start w:val="1"/>
+      <w:numFmt w:val="bullet"/>
+      <w:lvlText w:val=""/>
+      <w:lvlJc w:val="left"/>
+      <w:pPr>
+        <w:tabs>
+          <w:tab w:val="num" w:pos="2880"/>
+        </w:tabs>
+        <w:ind w:left="2880" w:hanging="360"/>
+      </w:pPr>
+      <w:rPr>
+        <w:rFonts w:ascii="Wingdings" w:hAnsi="Wingdings" w:hint="default"/>
+        <w:sz w:val="20"/>
+      </w:rPr>
+    </w:lvl>
+    <w:lvl w:ilvl="4" w:tentative="1">
+      <w:start w:val="1"/>
+      <w:numFmt w:val="bullet"/>
+      <w:lvlText w:val=""/>
+      <w:lvlJc w:val="left"/>
+      <w:pPr>
+        <w:tabs>
+          <w:tab w:val="num" w:pos="3600"/>
+        </w:tabs>
+        <w:ind w:left="3600" w:hanging="360"/>
+      </w:pPr>
+      <w:rPr>
+        <w:rFonts w:ascii="Wingdings" w:hAnsi="Wingdings" w:hint="default"/>
+        <w:sz w:val="20"/>
+      </w:rPr>
+    </w:lvl>
+    <w:lvl w:ilvl="5" w:tentative="1">
+      <w:start w:val="1"/>
+      <w:numFmt w:val="bullet"/>
+      <w:lvlText w:val=""/>
+      <w:lvlJc w:val="left"/>
+      <w:pPr>
+        <w:tabs>
+          <w:tab w:val="num" w:pos="4320"/>
+        </w:tabs>
+        <w:ind w:left="4320" w:hanging="360"/>
+      </w:pPr>
+      <w:rPr>
+        <w:rFonts w:ascii="Wingdings" w:hAnsi="Wingdings" w:hint="default"/>
+        <w:sz w:val="20"/>
+      </w:rPr>
+    </w:lvl>
+    <w:lvl w:ilvl="6" w:tentative="1">
+      <w:start w:val="1"/>
+      <w:numFmt w:val="bullet"/>
+      <w:lvlText w:val=""/>
+      <w:lvlJc w:val="left"/>
+      <w:pPr>
+        <w:tabs>
+          <w:tab w:val="num" w:pos="5040"/>
+        </w:tabs>
+        <w:ind w:left="5040" w:hanging="360"/>
+      </w:pPr>
+      <w:rPr>
+        <w:rFonts w:ascii="Wingdings" w:hAnsi="Wingdings" w:hint="default"/>
+        <w:sz w:val="20"/>
+      </w:rPr>
+    </w:lvl>
+    <w:lvl w:ilvl="7" w:tentative="1">
+      <w:start w:val="1"/>
+      <w:numFmt w:val="bullet"/>
+      <w:lvlText w:val=""/>
+      <w:lvlJc w:val="left"/>
+      <w:pPr>
+        <w:tabs>
+          <w:tab w:val="num" w:pos="5760"/>
+        </w:tabs>
+        <w:ind w:left="5760" w:hanging="360"/>
+      </w:pPr>
+      <w:rPr>
+        <w:rFonts w:ascii="Wingdings" w:hAnsi="Wingdings" w:hint="default"/>
+        <w:sz w:val="20"/>
+      </w:rPr>
+    </w:lvl>
+    <w:lvl w:ilvl="8" w:tentative="1">
+      <w:start w:val="1"/>
+      <w:numFmt w:val="bullet"/>
+      <w:lvlText w:val=""/>
+      <w:lvlJc w:val="left"/>
+      <w:pPr>
+        <w:tabs>
+          <w:tab w:val="num" w:pos="6480"/>
+        </w:tabs>
+        <w:ind w:left="6480" w:hanging="360"/>
+      </w:pPr>
+      <w:rPr>
+        <w:rFonts w:ascii="Wingdings" w:hAnsi="Wingdings" w:hint="default"/>
+        <w:sz w:val="20"/>
+      </w:rPr>
+    </w:lvl>
+  </w:abstractNum>
+  <w:abstractNum w:abstractNumId="3" w15:restartNumberingAfterBreak="0">
+    <w:nsid w:val="11D72426"/>
+    <w:multiLevelType w:val="multilevel"/>
+    <w:tmpl w:val="0ACEE89E"/>
+    <w:lvl w:ilvl="0">
+      <w:start w:val="1"/>
+      <w:numFmt w:val="bullet"/>
+      <w:lvlText w:val=""/>
+      <w:lvlJc w:val="left"/>
+      <w:pPr>
+        <w:tabs>
+          <w:tab w:val="num" w:pos="720"/>
+        </w:tabs>
+        <w:ind w:left="720" w:hanging="360"/>
+      </w:pPr>
+      <w:rPr>
+        <w:rFonts w:ascii="Symbol" w:hAnsi="Symbol" w:hint="default"/>
+        <w:sz w:val="20"/>
+      </w:rPr>
+    </w:lvl>
+    <w:lvl w:ilvl="1" w:tentative="1">
+      <w:start w:val="1"/>
+      <w:numFmt w:val="bullet"/>
+      <w:lvlText w:val="o"/>
+      <w:lvlJc w:val="left"/>
+      <w:pPr>
+        <w:tabs>
+          <w:tab w:val="num" w:pos="1440"/>
+        </w:tabs>
+        <w:ind w:left="1440" w:hanging="360"/>
+      </w:pPr>
+      <w:rPr>
+        <w:rFonts w:ascii="Courier New" w:hAnsi="Courier New" w:hint="default"/>
+        <w:sz w:val="20"/>
+      </w:rPr>
+    </w:lvl>
+    <w:lvl w:ilvl="2" w:tentative="1">
+      <w:start w:val="1"/>
+      <w:numFmt w:val="bullet"/>
+      <w:lvlText w:val=""/>
+      <w:lvlJc w:val="left"/>
+      <w:pPr>
+        <w:tabs>
+          <w:tab w:val="num" w:pos="2160"/>
+        </w:tabs>
+        <w:ind w:left="2160" w:hanging="360"/>
+      </w:pPr>
+      <w:rPr>
+        <w:rFonts w:ascii="Wingdings" w:hAnsi="Wingdings" w:hint="default"/>
+        <w:sz w:val="20"/>
+      </w:rPr>
+    </w:lvl>
+    <w:lvl w:ilvl="3" w:tentative="1">
+      <w:start w:val="1"/>
+      <w:numFmt w:val="bullet"/>
+      <w:lvlText w:val=""/>
+      <w:lvlJc w:val="left"/>
+      <w:pPr>
+        <w:tabs>
+          <w:tab w:val="num" w:pos="2880"/>
+        </w:tabs>
+        <w:ind w:left="2880" w:hanging="360"/>
+      </w:pPr>
+      <w:rPr>
+        <w:rFonts w:ascii="Wingdings" w:hAnsi="Wingdings" w:hint="default"/>
+        <w:sz w:val="20"/>
+      </w:rPr>
+    </w:lvl>
+    <w:lvl w:ilvl="4" w:tentative="1">
+      <w:start w:val="1"/>
+      <w:numFmt w:val="bullet"/>
+      <w:lvlText w:val=""/>
+      <w:lvlJc w:val="left"/>
+      <w:pPr>
+        <w:tabs>
+          <w:tab w:val="num" w:pos="3600"/>
+        </w:tabs>
+        <w:ind w:left="3600" w:hanging="360"/>
+      </w:pPr>
+      <w:rPr>
+        <w:rFonts w:ascii="Wingdings" w:hAnsi="Wingdings" w:hint="default"/>
+        <w:sz w:val="20"/>
+      </w:rPr>
+    </w:lvl>
+    <w:lvl w:ilvl="5" w:tentative="1">
+      <w:start w:val="1"/>
+      <w:numFmt w:val="bullet"/>
+      <w:lvlText w:val=""/>
+      <w:lvlJc w:val="left"/>
+      <w:pPr>
+        <w:tabs>
+          <w:tab w:val="num" w:pos="4320"/>
+        </w:tabs>
+        <w:ind w:left="4320" w:hanging="360"/>
+      </w:pPr>
+      <w:rPr>
+        <w:rFonts w:ascii="Wingdings" w:hAnsi="Wingdings" w:hint="default"/>
+        <w:sz w:val="20"/>
+      </w:rPr>
+    </w:lvl>
+    <w:lvl w:ilvl="6" w:tentative="1">
+      <w:start w:val="1"/>
+      <w:numFmt w:val="bullet"/>
+      <w:lvlText w:val=""/>
+      <w:lvlJc w:val="left"/>
+      <w:pPr>
+        <w:tabs>
+          <w:tab w:val="num" w:pos="5040"/>
+        </w:tabs>
+        <w:ind w:left="5040" w:hanging="360"/>
+      </w:pPr>
+      <w:rPr>
+        <w:rFonts w:ascii="Wingdings" w:hAnsi="Wingdings" w:hint="default"/>
+        <w:sz w:val="20"/>
+      </w:rPr>
+    </w:lvl>
+    <w:lvl w:ilvl="7" w:tentative="1">
+      <w:start w:val="1"/>
+      <w:numFmt w:val="bullet"/>
+      <w:lvlText w:val=""/>
+      <w:lvlJc w:val="left"/>
+      <w:pPr>
+        <w:tabs>
+          <w:tab w:val="num" w:pos="5760"/>
+        </w:tabs>
+        <w:ind w:left="5760" w:hanging="360"/>
+      </w:pPr>
+      <w:rPr>
+        <w:rFonts w:ascii="Wingdings" w:hAnsi="Wingdings" w:hint="default"/>
+        <w:sz w:val="20"/>
+      </w:rPr>
+    </w:lvl>
+    <w:lvl w:ilvl="8" w:tentative="1">
+      <w:start w:val="1"/>
+      <w:numFmt w:val="bullet"/>
+      <w:lvlText w:val=""/>
+      <w:lvlJc w:val="left"/>
+      <w:pPr>
+        <w:tabs>
+          <w:tab w:val="num" w:pos="6480"/>
+        </w:tabs>
+        <w:ind w:left="6480" w:hanging="360"/>
+      </w:pPr>
+      <w:rPr>
+        <w:rFonts w:ascii="Wingdings" w:hAnsi="Wingdings" w:hint="default"/>
+        <w:sz w:val="20"/>
+      </w:rPr>
+    </w:lvl>
+  </w:abstractNum>
+  <w:abstractNum w:abstractNumId="4" w15:restartNumberingAfterBreak="0">
     <w:nsid w:val="157300D2"/>
     <w:multiLevelType w:val="multilevel"/>
     <w:tmpl w:val="35B0265C"/>
@@ -2936,7 +4636,7 @@
       </w:rPr>
     </w:lvl>
   </w:abstractNum>
-  <w:abstractNum w:abstractNumId="1" w15:restartNumberingAfterBreak="0">
+  <w:abstractNum w:abstractNumId="5" w15:restartNumberingAfterBreak="0">
     <w:nsid w:val="1C731412"/>
     <w:multiLevelType w:val="multilevel"/>
     <w:tmpl w:val="697425DA"/>
@@ -3085,7 +4785,7 @@
       </w:rPr>
     </w:lvl>
   </w:abstractNum>
-  <w:abstractNum w:abstractNumId="2" w15:restartNumberingAfterBreak="0">
+  <w:abstractNum w:abstractNumId="6" w15:restartNumberingAfterBreak="0">
     <w:nsid w:val="2231613E"/>
     <w:multiLevelType w:val="multilevel"/>
     <w:tmpl w:val="8E586724"/>
@@ -3234,7 +4934,7 @@
       </w:rPr>
     </w:lvl>
   </w:abstractNum>
-  <w:abstractNum w:abstractNumId="3" w15:restartNumberingAfterBreak="0">
+  <w:abstractNum w:abstractNumId="7" w15:restartNumberingAfterBreak="0">
     <w:nsid w:val="29AA1397"/>
     <w:multiLevelType w:val="multilevel"/>
     <w:tmpl w:val="890070A6"/>
@@ -3383,7 +5083,7 @@
       </w:rPr>
     </w:lvl>
   </w:abstractNum>
-  <w:abstractNum w:abstractNumId="4" w15:restartNumberingAfterBreak="0">
+  <w:abstractNum w:abstractNumId="8" w15:restartNumberingAfterBreak="0">
     <w:nsid w:val="2A68242D"/>
     <w:multiLevelType w:val="multilevel"/>
     <w:tmpl w:val="1EA2B492"/>
@@ -3532,7 +5232,7 @@
       </w:rPr>
     </w:lvl>
   </w:abstractNum>
-  <w:abstractNum w:abstractNumId="5" w15:restartNumberingAfterBreak="0">
+  <w:abstractNum w:abstractNumId="9" w15:restartNumberingAfterBreak="0">
     <w:nsid w:val="2B812C48"/>
     <w:multiLevelType w:val="multilevel"/>
     <w:tmpl w:val="E95AAA94"/>
@@ -3681,7 +5381,7 @@
       </w:rPr>
     </w:lvl>
   </w:abstractNum>
-  <w:abstractNum w:abstractNumId="6" w15:restartNumberingAfterBreak="0">
+  <w:abstractNum w:abstractNumId="10" w15:restartNumberingAfterBreak="0">
     <w:nsid w:val="34706550"/>
     <w:multiLevelType w:val="multilevel"/>
     <w:tmpl w:val="E550F2B6"/>
@@ -3830,7 +5530,120 @@
       </w:rPr>
     </w:lvl>
   </w:abstractNum>
-  <w:abstractNum w:abstractNumId="7" w15:restartNumberingAfterBreak="0">
+  <w:abstractNum w:abstractNumId="11" w15:restartNumberingAfterBreak="0">
+    <w:nsid w:val="43B2543E"/>
+    <w:multiLevelType w:val="multilevel"/>
+    <w:tmpl w:val="19CC007C"/>
+    <w:lvl w:ilvl="0">
+      <w:start w:val="1"/>
+      <w:numFmt w:val="decimal"/>
+      <w:lvlText w:val="%1."/>
+      <w:lvlJc w:val="left"/>
+      <w:pPr>
+        <w:tabs>
+          <w:tab w:val="num" w:pos="720"/>
+        </w:tabs>
+        <w:ind w:left="720" w:hanging="360"/>
+      </w:pPr>
+    </w:lvl>
+    <w:lvl w:ilvl="1" w:tentative="1">
+      <w:start w:val="1"/>
+      <w:numFmt w:val="decimal"/>
+      <w:lvlText w:val="%2."/>
+      <w:lvlJc w:val="left"/>
+      <w:pPr>
+        <w:tabs>
+          <w:tab w:val="num" w:pos="1440"/>
+        </w:tabs>
+        <w:ind w:left="1440" w:hanging="360"/>
+      </w:pPr>
+    </w:lvl>
+    <w:lvl w:ilvl="2" w:tentative="1">
+      <w:start w:val="1"/>
+      <w:numFmt w:val="decimal"/>
+      <w:lvlText w:val="%3."/>
+      <w:lvlJc w:val="left"/>
+      <w:pPr>
+        <w:tabs>
+          <w:tab w:val="num" w:pos="2160"/>
+        </w:tabs>
+        <w:ind w:left="2160" w:hanging="360"/>
+      </w:pPr>
+    </w:lvl>
+    <w:lvl w:ilvl="3" w:tentative="1">
+      <w:start w:val="1"/>
+      <w:numFmt w:val="decimal"/>
+      <w:lvlText w:val="%4."/>
+      <w:lvlJc w:val="left"/>
+      <w:pPr>
+        <w:tabs>
+          <w:tab w:val="num" w:pos="2880"/>
+        </w:tabs>
+        <w:ind w:left="2880" w:hanging="360"/>
+      </w:pPr>
+    </w:lvl>
+    <w:lvl w:ilvl="4" w:tentative="1">
+      <w:start w:val="1"/>
+      <w:numFmt w:val="decimal"/>
+      <w:lvlText w:val="%5."/>
+      <w:lvlJc w:val="left"/>
+      <w:pPr>
+        <w:tabs>
+          <w:tab w:val="num" w:pos="3600"/>
+        </w:tabs>
+        <w:ind w:left="3600" w:hanging="360"/>
+      </w:pPr>
+    </w:lvl>
+    <w:lvl w:ilvl="5" w:tentative="1">
+      <w:start w:val="1"/>
+      <w:numFmt w:val="decimal"/>
+      <w:lvlText w:val="%6."/>
+      <w:lvlJc w:val="left"/>
+      <w:pPr>
+        <w:tabs>
+          <w:tab w:val="num" w:pos="4320"/>
+        </w:tabs>
+        <w:ind w:left="4320" w:hanging="360"/>
+      </w:pPr>
+    </w:lvl>
+    <w:lvl w:ilvl="6" w:tentative="1">
+      <w:start w:val="1"/>
+      <w:numFmt w:val="decimal"/>
+      <w:lvlText w:val="%7."/>
+      <w:lvlJc w:val="left"/>
+      <w:pPr>
+        <w:tabs>
+          <w:tab w:val="num" w:pos="5040"/>
+        </w:tabs>
+        <w:ind w:left="5040" w:hanging="360"/>
+      </w:pPr>
+    </w:lvl>
+    <w:lvl w:ilvl="7" w:tentative="1">
+      <w:start w:val="1"/>
+      <w:numFmt w:val="decimal"/>
+      <w:lvlText w:val="%8."/>
+      <w:lvlJc w:val="left"/>
+      <w:pPr>
+        <w:tabs>
+          <w:tab w:val="num" w:pos="5760"/>
+        </w:tabs>
+        <w:ind w:left="5760" w:hanging="360"/>
+      </w:pPr>
+    </w:lvl>
+    <w:lvl w:ilvl="8" w:tentative="1">
+      <w:start w:val="1"/>
+      <w:numFmt w:val="decimal"/>
+      <w:lvlText w:val="%9."/>
+      <w:lvlJc w:val="left"/>
+      <w:pPr>
+        <w:tabs>
+          <w:tab w:val="num" w:pos="6480"/>
+        </w:tabs>
+        <w:ind w:left="6480" w:hanging="360"/>
+      </w:pPr>
+    </w:lvl>
+  </w:abstractNum>
+  <w:abstractNum w:abstractNumId="12" w15:restartNumberingAfterBreak="0">
     <w:nsid w:val="4DDA5C91"/>
     <w:multiLevelType w:val="multilevel"/>
     <w:tmpl w:val="D71ABF80"/>
@@ -3943,7 +5756,305 @@
       </w:pPr>
     </w:lvl>
   </w:abstractNum>
-  <w:abstractNum w:abstractNumId="8" w15:restartNumberingAfterBreak="0">
+  <w:abstractNum w:abstractNumId="13" w15:restartNumberingAfterBreak="0">
+    <w:nsid w:val="50BC7ABA"/>
+    <w:multiLevelType w:val="multilevel"/>
+    <w:tmpl w:val="FE280AB6"/>
+    <w:lvl w:ilvl="0">
+      <w:start w:val="1"/>
+      <w:numFmt w:val="bullet"/>
+      <w:lvlText w:val=""/>
+      <w:lvlJc w:val="left"/>
+      <w:pPr>
+        <w:tabs>
+          <w:tab w:val="num" w:pos="720"/>
+        </w:tabs>
+        <w:ind w:left="720" w:hanging="360"/>
+      </w:pPr>
+      <w:rPr>
+        <w:rFonts w:ascii="Symbol" w:hAnsi="Symbol" w:hint="default"/>
+        <w:sz w:val="20"/>
+      </w:rPr>
+    </w:lvl>
+    <w:lvl w:ilvl="1" w:tentative="1">
+      <w:start w:val="1"/>
+      <w:numFmt w:val="bullet"/>
+      <w:lvlText w:val="o"/>
+      <w:lvlJc w:val="left"/>
+      <w:pPr>
+        <w:tabs>
+          <w:tab w:val="num" w:pos="1440"/>
+        </w:tabs>
+        <w:ind w:left="1440" w:hanging="360"/>
+      </w:pPr>
+      <w:rPr>
+        <w:rFonts w:ascii="Courier New" w:hAnsi="Courier New" w:hint="default"/>
+        <w:sz w:val="20"/>
+      </w:rPr>
+    </w:lvl>
+    <w:lvl w:ilvl="2" w:tentative="1">
+      <w:start w:val="1"/>
+      <w:numFmt w:val="bullet"/>
+      <w:lvlText w:val=""/>
+      <w:lvlJc w:val="left"/>
+      <w:pPr>
+        <w:tabs>
+          <w:tab w:val="num" w:pos="2160"/>
+        </w:tabs>
+        <w:ind w:left="2160" w:hanging="360"/>
+      </w:pPr>
+      <w:rPr>
+        <w:rFonts w:ascii="Wingdings" w:hAnsi="Wingdings" w:hint="default"/>
+        <w:sz w:val="20"/>
+      </w:rPr>
+    </w:lvl>
+    <w:lvl w:ilvl="3" w:tentative="1">
+      <w:start w:val="1"/>
+      <w:numFmt w:val="bullet"/>
+      <w:lvlText w:val=""/>
+      <w:lvlJc w:val="left"/>
+      <w:pPr>
+        <w:tabs>
+          <w:tab w:val="num" w:pos="2880"/>
+        </w:tabs>
+        <w:ind w:left="2880" w:hanging="360"/>
+      </w:pPr>
+      <w:rPr>
+        <w:rFonts w:ascii="Wingdings" w:hAnsi="Wingdings" w:hint="default"/>
+        <w:sz w:val="20"/>
+      </w:rPr>
+    </w:lvl>
+    <w:lvl w:ilvl="4" w:tentative="1">
+      <w:start w:val="1"/>
+      <w:numFmt w:val="bullet"/>
+      <w:lvlText w:val=""/>
+      <w:lvlJc w:val="left"/>
+      <w:pPr>
+        <w:tabs>
+          <w:tab w:val="num" w:pos="3600"/>
+        </w:tabs>
+        <w:ind w:left="3600" w:hanging="360"/>
+      </w:pPr>
+      <w:rPr>
+        <w:rFonts w:ascii="Wingdings" w:hAnsi="Wingdings" w:hint="default"/>
+        <w:sz w:val="20"/>
+      </w:rPr>
+    </w:lvl>
+    <w:lvl w:ilvl="5" w:tentative="1">
+      <w:start w:val="1"/>
+      <w:numFmt w:val="bullet"/>
+      <w:lvlText w:val=""/>
+      <w:lvlJc w:val="left"/>
+      <w:pPr>
+        <w:tabs>
+          <w:tab w:val="num" w:pos="4320"/>
+        </w:tabs>
+        <w:ind w:left="4320" w:hanging="360"/>
+      </w:pPr>
+      <w:rPr>
+        <w:rFonts w:ascii="Wingdings" w:hAnsi="Wingdings" w:hint="default"/>
+        <w:sz w:val="20"/>
+      </w:rPr>
+    </w:lvl>
+    <w:lvl w:ilvl="6" w:tentative="1">
+      <w:start w:val="1"/>
+      <w:numFmt w:val="bullet"/>
+      <w:lvlText w:val=""/>
+      <w:lvlJc w:val="left"/>
+      <w:pPr>
+        <w:tabs>
+          <w:tab w:val="num" w:pos="5040"/>
+        </w:tabs>
+        <w:ind w:left="5040" w:hanging="360"/>
+      </w:pPr>
+      <w:rPr>
+        <w:rFonts w:ascii="Wingdings" w:hAnsi="Wingdings" w:hint="default"/>
+        <w:sz w:val="20"/>
+      </w:rPr>
+    </w:lvl>
+    <w:lvl w:ilvl="7" w:tentative="1">
+      <w:start w:val="1"/>
+      <w:numFmt w:val="bullet"/>
+      <w:lvlText w:val=""/>
+      <w:lvlJc w:val="left"/>
+      <w:pPr>
+        <w:tabs>
+          <w:tab w:val="num" w:pos="5760"/>
+        </w:tabs>
+        <w:ind w:left="5760" w:hanging="360"/>
+      </w:pPr>
+      <w:rPr>
+        <w:rFonts w:ascii="Wingdings" w:hAnsi="Wingdings" w:hint="default"/>
+        <w:sz w:val="20"/>
+      </w:rPr>
+    </w:lvl>
+    <w:lvl w:ilvl="8" w:tentative="1">
+      <w:start w:val="1"/>
+      <w:numFmt w:val="bullet"/>
+      <w:lvlText w:val=""/>
+      <w:lvlJc w:val="left"/>
+      <w:pPr>
+        <w:tabs>
+          <w:tab w:val="num" w:pos="6480"/>
+        </w:tabs>
+        <w:ind w:left="6480" w:hanging="360"/>
+      </w:pPr>
+      <w:rPr>
+        <w:rFonts w:ascii="Wingdings" w:hAnsi="Wingdings" w:hint="default"/>
+        <w:sz w:val="20"/>
+      </w:rPr>
+    </w:lvl>
+  </w:abstractNum>
+  <w:abstractNum w:abstractNumId="14" w15:restartNumberingAfterBreak="0">
+    <w:nsid w:val="5A4E1EAC"/>
+    <w:multiLevelType w:val="multilevel"/>
+    <w:tmpl w:val="B98238F4"/>
+    <w:lvl w:ilvl="0">
+      <w:start w:val="1"/>
+      <w:numFmt w:val="bullet"/>
+      <w:lvlText w:val=""/>
+      <w:lvlJc w:val="left"/>
+      <w:pPr>
+        <w:tabs>
+          <w:tab w:val="num" w:pos="720"/>
+        </w:tabs>
+        <w:ind w:left="720" w:hanging="360"/>
+      </w:pPr>
+      <w:rPr>
+        <w:rFonts w:ascii="Symbol" w:hAnsi="Symbol" w:hint="default"/>
+        <w:sz w:val="20"/>
+      </w:rPr>
+    </w:lvl>
+    <w:lvl w:ilvl="1" w:tentative="1">
+      <w:start w:val="1"/>
+      <w:numFmt w:val="bullet"/>
+      <w:lvlText w:val="o"/>
+      <w:lvlJc w:val="left"/>
+      <w:pPr>
+        <w:tabs>
+          <w:tab w:val="num" w:pos="1440"/>
+        </w:tabs>
+        <w:ind w:left="1440" w:hanging="360"/>
+      </w:pPr>
+      <w:rPr>
+        <w:rFonts w:ascii="Courier New" w:hAnsi="Courier New" w:hint="default"/>
+        <w:sz w:val="20"/>
+      </w:rPr>
+    </w:lvl>
+    <w:lvl w:ilvl="2" w:tentative="1">
+      <w:start w:val="1"/>
+      <w:numFmt w:val="bullet"/>
+      <w:lvlText w:val=""/>
+      <w:lvlJc w:val="left"/>
+      <w:pPr>
+        <w:tabs>
+          <w:tab w:val="num" w:pos="2160"/>
+        </w:tabs>
+        <w:ind w:left="2160" w:hanging="360"/>
+      </w:pPr>
+      <w:rPr>
+        <w:rFonts w:ascii="Wingdings" w:hAnsi="Wingdings" w:hint="default"/>
+        <w:sz w:val="20"/>
+      </w:rPr>
+    </w:lvl>
+    <w:lvl w:ilvl="3" w:tentative="1">
+      <w:start w:val="1"/>
+      <w:numFmt w:val="bullet"/>
+      <w:lvlText w:val=""/>
+      <w:lvlJc w:val="left"/>
+      <w:pPr>
+        <w:tabs>
+          <w:tab w:val="num" w:pos="2880"/>
+        </w:tabs>
+        <w:ind w:left="2880" w:hanging="360"/>
+      </w:pPr>
+      <w:rPr>
+        <w:rFonts w:ascii="Wingdings" w:hAnsi="Wingdings" w:hint="default"/>
+        <w:sz w:val="20"/>
+      </w:rPr>
+    </w:lvl>
+    <w:lvl w:ilvl="4" w:tentative="1">
+      <w:start w:val="1"/>
+      <w:numFmt w:val="bullet"/>
+      <w:lvlText w:val=""/>
+      <w:lvlJc w:val="left"/>
+      <w:pPr>
+        <w:tabs>
+          <w:tab w:val="num" w:pos="3600"/>
+        </w:tabs>
+        <w:ind w:left="3600" w:hanging="360"/>
+      </w:pPr>
+      <w:rPr>
+        <w:rFonts w:ascii="Wingdings" w:hAnsi="Wingdings" w:hint="default"/>
+        <w:sz w:val="20"/>
+      </w:rPr>
+    </w:lvl>
+    <w:lvl w:ilvl="5" w:tentative="1">
+      <w:start w:val="1"/>
+      <w:numFmt w:val="bullet"/>
+      <w:lvlText w:val=""/>
+      <w:lvlJc w:val="left"/>
+      <w:pPr>
+        <w:tabs>
+          <w:tab w:val="num" w:pos="4320"/>
+        </w:tabs>
+        <w:ind w:left="4320" w:hanging="360"/>
+      </w:pPr>
+      <w:rPr>
+        <w:rFonts w:ascii="Wingdings" w:hAnsi="Wingdings" w:hint="default"/>
+        <w:sz w:val="20"/>
+      </w:rPr>
+    </w:lvl>
+    <w:lvl w:ilvl="6" w:tentative="1">
+      <w:start w:val="1"/>
+      <w:numFmt w:val="bullet"/>
+      <w:lvlText w:val=""/>
+      <w:lvlJc w:val="left"/>
+      <w:pPr>
+        <w:tabs>
+          <w:tab w:val="num" w:pos="5040"/>
+        </w:tabs>
+        <w:ind w:left="5040" w:hanging="360"/>
+      </w:pPr>
+      <w:rPr>
+        <w:rFonts w:ascii="Wingdings" w:hAnsi="Wingdings" w:hint="default"/>
+        <w:sz w:val="20"/>
+      </w:rPr>
+    </w:lvl>
+    <w:lvl w:ilvl="7" w:tentative="1">
+      <w:start w:val="1"/>
+      <w:numFmt w:val="bullet"/>
+      <w:lvlText w:val=""/>
+      <w:lvlJc w:val="left"/>
+      <w:pPr>
+        <w:tabs>
+          <w:tab w:val="num" w:pos="5760"/>
+        </w:tabs>
+        <w:ind w:left="5760" w:hanging="360"/>
+      </w:pPr>
+      <w:rPr>
+        <w:rFonts w:ascii="Wingdings" w:hAnsi="Wingdings" w:hint="default"/>
+        <w:sz w:val="20"/>
+      </w:rPr>
+    </w:lvl>
+    <w:lvl w:ilvl="8" w:tentative="1">
+      <w:start w:val="1"/>
+      <w:numFmt w:val="bullet"/>
+      <w:lvlText w:val=""/>
+      <w:lvlJc w:val="left"/>
+      <w:pPr>
+        <w:tabs>
+          <w:tab w:val="num" w:pos="6480"/>
+        </w:tabs>
+        <w:ind w:left="6480" w:hanging="360"/>
+      </w:pPr>
+      <w:rPr>
+        <w:rFonts w:ascii="Wingdings" w:hAnsi="Wingdings" w:hint="default"/>
+        <w:sz w:val="20"/>
+      </w:rPr>
+    </w:lvl>
+  </w:abstractNum>
+  <w:abstractNum w:abstractNumId="15" w15:restartNumberingAfterBreak="0">
     <w:nsid w:val="5BB740B3"/>
     <w:multiLevelType w:val="multilevel"/>
     <w:tmpl w:val="B58C46EC"/>
@@ -4092,7 +6203,156 @@
       </w:rPr>
     </w:lvl>
   </w:abstractNum>
-  <w:abstractNum w:abstractNumId="9" w15:restartNumberingAfterBreak="0">
+  <w:abstractNum w:abstractNumId="16" w15:restartNumberingAfterBreak="0">
+    <w:nsid w:val="5BD96168"/>
+    <w:multiLevelType w:val="multilevel"/>
+    <w:tmpl w:val="4FBC43AE"/>
+    <w:lvl w:ilvl="0">
+      <w:start w:val="1"/>
+      <w:numFmt w:val="bullet"/>
+      <w:lvlText w:val=""/>
+      <w:lvlJc w:val="left"/>
+      <w:pPr>
+        <w:tabs>
+          <w:tab w:val="num" w:pos="720"/>
+        </w:tabs>
+        <w:ind w:left="720" w:hanging="360"/>
+      </w:pPr>
+      <w:rPr>
+        <w:rFonts w:ascii="Symbol" w:hAnsi="Symbol" w:hint="default"/>
+        <w:sz w:val="20"/>
+      </w:rPr>
+    </w:lvl>
+    <w:lvl w:ilvl="1" w:tentative="1">
+      <w:start w:val="1"/>
+      <w:numFmt w:val="bullet"/>
+      <w:lvlText w:val="o"/>
+      <w:lvlJc w:val="left"/>
+      <w:pPr>
+        <w:tabs>
+          <w:tab w:val="num" w:pos="1440"/>
+        </w:tabs>
+        <w:ind w:left="1440" w:hanging="360"/>
+      </w:pPr>
+      <w:rPr>
+        <w:rFonts w:ascii="Courier New" w:hAnsi="Courier New" w:hint="default"/>
+        <w:sz w:val="20"/>
+      </w:rPr>
+    </w:lvl>
+    <w:lvl w:ilvl="2" w:tentative="1">
+      <w:start w:val="1"/>
+      <w:numFmt w:val="bullet"/>
+      <w:lvlText w:val=""/>
+      <w:lvlJc w:val="left"/>
+      <w:pPr>
+        <w:tabs>
+          <w:tab w:val="num" w:pos="2160"/>
+        </w:tabs>
+        <w:ind w:left="2160" w:hanging="360"/>
+      </w:pPr>
+      <w:rPr>
+        <w:rFonts w:ascii="Wingdings" w:hAnsi="Wingdings" w:hint="default"/>
+        <w:sz w:val="20"/>
+      </w:rPr>
+    </w:lvl>
+    <w:lvl w:ilvl="3" w:tentative="1">
+      <w:start w:val="1"/>
+      <w:numFmt w:val="bullet"/>
+      <w:lvlText w:val=""/>
+      <w:lvlJc w:val="left"/>
+      <w:pPr>
+        <w:tabs>
+          <w:tab w:val="num" w:pos="2880"/>
+        </w:tabs>
+        <w:ind w:left="2880" w:hanging="360"/>
+      </w:pPr>
+      <w:rPr>
+        <w:rFonts w:ascii="Wingdings" w:hAnsi="Wingdings" w:hint="default"/>
+        <w:sz w:val="20"/>
+      </w:rPr>
+    </w:lvl>
+    <w:lvl w:ilvl="4" w:tentative="1">
+      <w:start w:val="1"/>
+      <w:numFmt w:val="bullet"/>
+      <w:lvlText w:val=""/>
+      <w:lvlJc w:val="left"/>
+      <w:pPr>
+        <w:tabs>
+          <w:tab w:val="num" w:pos="3600"/>
+        </w:tabs>
+        <w:ind w:left="3600" w:hanging="360"/>
+      </w:pPr>
+      <w:rPr>
+        <w:rFonts w:ascii="Wingdings" w:hAnsi="Wingdings" w:hint="default"/>
+        <w:sz w:val="20"/>
+      </w:rPr>
+    </w:lvl>
+    <w:lvl w:ilvl="5" w:tentative="1">
+      <w:start w:val="1"/>
+      <w:numFmt w:val="bullet"/>
+      <w:lvlText w:val=""/>
+      <w:lvlJc w:val="left"/>
+      <w:pPr>
+        <w:tabs>
+          <w:tab w:val="num" w:pos="4320"/>
+        </w:tabs>
+        <w:ind w:left="4320" w:hanging="360"/>
+      </w:pPr>
+      <w:rPr>
+        <w:rFonts w:ascii="Wingdings" w:hAnsi="Wingdings" w:hint="default"/>
+        <w:sz w:val="20"/>
+      </w:rPr>
+    </w:lvl>
+    <w:lvl w:ilvl="6" w:tentative="1">
+      <w:start w:val="1"/>
+      <w:numFmt w:val="bullet"/>
+      <w:lvlText w:val=""/>
+      <w:lvlJc w:val="left"/>
+      <w:pPr>
+        <w:tabs>
+          <w:tab w:val="num" w:pos="5040"/>
+        </w:tabs>
+        <w:ind w:left="5040" w:hanging="360"/>
+      </w:pPr>
+      <w:rPr>
+        <w:rFonts w:ascii="Wingdings" w:hAnsi="Wingdings" w:hint="default"/>
+        <w:sz w:val="20"/>
+      </w:rPr>
+    </w:lvl>
+    <w:lvl w:ilvl="7" w:tentative="1">
+      <w:start w:val="1"/>
+      <w:numFmt w:val="bullet"/>
+      <w:lvlText w:val=""/>
+      <w:lvlJc w:val="left"/>
+      <w:pPr>
+        <w:tabs>
+          <w:tab w:val="num" w:pos="5760"/>
+        </w:tabs>
+        <w:ind w:left="5760" w:hanging="360"/>
+      </w:pPr>
+      <w:rPr>
+        <w:rFonts w:ascii="Wingdings" w:hAnsi="Wingdings" w:hint="default"/>
+        <w:sz w:val="20"/>
+      </w:rPr>
+    </w:lvl>
+    <w:lvl w:ilvl="8" w:tentative="1">
+      <w:start w:val="1"/>
+      <w:numFmt w:val="bullet"/>
+      <w:lvlText w:val=""/>
+      <w:lvlJc w:val="left"/>
+      <w:pPr>
+        <w:tabs>
+          <w:tab w:val="num" w:pos="6480"/>
+        </w:tabs>
+        <w:ind w:left="6480" w:hanging="360"/>
+      </w:pPr>
+      <w:rPr>
+        <w:rFonts w:ascii="Wingdings" w:hAnsi="Wingdings" w:hint="default"/>
+        <w:sz w:val="20"/>
+      </w:rPr>
+    </w:lvl>
+  </w:abstractNum>
+  <w:abstractNum w:abstractNumId="17" w15:restartNumberingAfterBreak="0">
     <w:nsid w:val="5D0B4529"/>
     <w:multiLevelType w:val="multilevel"/>
     <w:tmpl w:val="07464F6A"/>
@@ -4241,7 +6501,7 @@
       </w:rPr>
     </w:lvl>
   </w:abstractNum>
-  <w:abstractNum w:abstractNumId="10" w15:restartNumberingAfterBreak="0">
+  <w:abstractNum w:abstractNumId="18" w15:restartNumberingAfterBreak="0">
     <w:nsid w:val="5F1C009E"/>
     <w:multiLevelType w:val="multilevel"/>
     <w:tmpl w:val="94A4D474"/>
@@ -4390,7 +6650,7 @@
       </w:rPr>
     </w:lvl>
   </w:abstractNum>
-  <w:abstractNum w:abstractNumId="11" w15:restartNumberingAfterBreak="0">
+  <w:abstractNum w:abstractNumId="19" w15:restartNumberingAfterBreak="0">
     <w:nsid w:val="5FD7754A"/>
     <w:multiLevelType w:val="multilevel"/>
     <w:tmpl w:val="F280CC86"/>
@@ -4539,7 +6799,7 @@
       </w:rPr>
     </w:lvl>
   </w:abstractNum>
-  <w:abstractNum w:abstractNumId="12" w15:restartNumberingAfterBreak="0">
+  <w:abstractNum w:abstractNumId="20" w15:restartNumberingAfterBreak="0">
     <w:nsid w:val="64140F6D"/>
     <w:multiLevelType w:val="multilevel"/>
     <w:tmpl w:val="E1565BE2"/>
@@ -4688,7 +6948,7 @@
       </w:rPr>
     </w:lvl>
   </w:abstractNum>
-  <w:abstractNum w:abstractNumId="13" w15:restartNumberingAfterBreak="0">
+  <w:abstractNum w:abstractNumId="21" w15:restartNumberingAfterBreak="0">
     <w:nsid w:val="66F47B32"/>
     <w:multiLevelType w:val="multilevel"/>
     <w:tmpl w:val="DBE21C08"/>
@@ -4837,7 +7097,7 @@
       </w:rPr>
     </w:lvl>
   </w:abstractNum>
-  <w:abstractNum w:abstractNumId="14" w15:restartNumberingAfterBreak="0">
+  <w:abstractNum w:abstractNumId="22" w15:restartNumberingAfterBreak="0">
     <w:nsid w:val="673777ED"/>
     <w:multiLevelType w:val="multilevel"/>
     <w:tmpl w:val="3AF2BAE4"/>
@@ -4986,7 +7246,7 @@
       </w:rPr>
     </w:lvl>
   </w:abstractNum>
-  <w:abstractNum w:abstractNumId="15" w15:restartNumberingAfterBreak="0">
+  <w:abstractNum w:abstractNumId="23" w15:restartNumberingAfterBreak="0">
     <w:nsid w:val="67AC75D7"/>
     <w:multiLevelType w:val="multilevel"/>
     <w:tmpl w:val="219CD3CE"/>
@@ -5135,7 +7395,156 @@
       </w:rPr>
     </w:lvl>
   </w:abstractNum>
-  <w:abstractNum w:abstractNumId="16" w15:restartNumberingAfterBreak="0">
+  <w:abstractNum w:abstractNumId="24" w15:restartNumberingAfterBreak="0">
+    <w:nsid w:val="6EC830FC"/>
+    <w:multiLevelType w:val="multilevel"/>
+    <w:tmpl w:val="EA88F8AA"/>
+    <w:lvl w:ilvl="0">
+      <w:start w:val="1"/>
+      <w:numFmt w:val="bullet"/>
+      <w:lvlText w:val=""/>
+      <w:lvlJc w:val="left"/>
+      <w:pPr>
+        <w:tabs>
+          <w:tab w:val="num" w:pos="720"/>
+        </w:tabs>
+        <w:ind w:left="720" w:hanging="360"/>
+      </w:pPr>
+      <w:rPr>
+        <w:rFonts w:ascii="Symbol" w:hAnsi="Symbol" w:hint="default"/>
+        <w:sz w:val="20"/>
+      </w:rPr>
+    </w:lvl>
+    <w:lvl w:ilvl="1" w:tentative="1">
+      <w:start w:val="1"/>
+      <w:numFmt w:val="bullet"/>
+      <w:lvlText w:val="o"/>
+      <w:lvlJc w:val="left"/>
+      <w:pPr>
+        <w:tabs>
+          <w:tab w:val="num" w:pos="1440"/>
+        </w:tabs>
+        <w:ind w:left="1440" w:hanging="360"/>
+      </w:pPr>
+      <w:rPr>
+        <w:rFonts w:ascii="Courier New" w:hAnsi="Courier New" w:hint="default"/>
+        <w:sz w:val="20"/>
+      </w:rPr>
+    </w:lvl>
+    <w:lvl w:ilvl="2" w:tentative="1">
+      <w:start w:val="1"/>
+      <w:numFmt w:val="bullet"/>
+      <w:lvlText w:val=""/>
+      <w:lvlJc w:val="left"/>
+      <w:pPr>
+        <w:tabs>
+          <w:tab w:val="num" w:pos="2160"/>
+        </w:tabs>
+        <w:ind w:left="2160" w:hanging="360"/>
+      </w:pPr>
+      <w:rPr>
+        <w:rFonts w:ascii="Wingdings" w:hAnsi="Wingdings" w:hint="default"/>
+        <w:sz w:val="20"/>
+      </w:rPr>
+    </w:lvl>
+    <w:lvl w:ilvl="3" w:tentative="1">
+      <w:start w:val="1"/>
+      <w:numFmt w:val="bullet"/>
+      <w:lvlText w:val=""/>
+      <w:lvlJc w:val="left"/>
+      <w:pPr>
+        <w:tabs>
+          <w:tab w:val="num" w:pos="2880"/>
+        </w:tabs>
+        <w:ind w:left="2880" w:hanging="360"/>
+      </w:pPr>
+      <w:rPr>
+        <w:rFonts w:ascii="Wingdings" w:hAnsi="Wingdings" w:hint="default"/>
+        <w:sz w:val="20"/>
+      </w:rPr>
+    </w:lvl>
+    <w:lvl w:ilvl="4" w:tentative="1">
+      <w:start w:val="1"/>
+      <w:numFmt w:val="bullet"/>
+      <w:lvlText w:val=""/>
+      <w:lvlJc w:val="left"/>
+      <w:pPr>
+        <w:tabs>
+          <w:tab w:val="num" w:pos="3600"/>
+        </w:tabs>
+        <w:ind w:left="3600" w:hanging="360"/>
+      </w:pPr>
+      <w:rPr>
+        <w:rFonts w:ascii="Wingdings" w:hAnsi="Wingdings" w:hint="default"/>
+        <w:sz w:val="20"/>
+      </w:rPr>
+    </w:lvl>
+    <w:lvl w:ilvl="5" w:tentative="1">
+      <w:start w:val="1"/>
+      <w:numFmt w:val="bullet"/>
+      <w:lvlText w:val=""/>
+      <w:lvlJc w:val="left"/>
+      <w:pPr>
+        <w:tabs>
+          <w:tab w:val="num" w:pos="4320"/>
+        </w:tabs>
+        <w:ind w:left="4320" w:hanging="360"/>
+      </w:pPr>
+      <w:rPr>
+        <w:rFonts w:ascii="Wingdings" w:hAnsi="Wingdings" w:hint="default"/>
+        <w:sz w:val="20"/>
+      </w:rPr>
+    </w:lvl>
+    <w:lvl w:ilvl="6" w:tentative="1">
+      <w:start w:val="1"/>
+      <w:numFmt w:val="bullet"/>
+      <w:lvlText w:val=""/>
+      <w:lvlJc w:val="left"/>
+      <w:pPr>
+        <w:tabs>
+          <w:tab w:val="num" w:pos="5040"/>
+        </w:tabs>
+        <w:ind w:left="5040" w:hanging="360"/>
+      </w:pPr>
+      <w:rPr>
+        <w:rFonts w:ascii="Wingdings" w:hAnsi="Wingdings" w:hint="default"/>
+        <w:sz w:val="20"/>
+      </w:rPr>
+    </w:lvl>
+    <w:lvl w:ilvl="7" w:tentative="1">
+      <w:start w:val="1"/>
+      <w:numFmt w:val="bullet"/>
+      <w:lvlText w:val=""/>
+      <w:lvlJc w:val="left"/>
+      <w:pPr>
+        <w:tabs>
+          <w:tab w:val="num" w:pos="5760"/>
+        </w:tabs>
+        <w:ind w:left="5760" w:hanging="360"/>
+      </w:pPr>
+      <w:rPr>
+        <w:rFonts w:ascii="Wingdings" w:hAnsi="Wingdings" w:hint="default"/>
+        <w:sz w:val="20"/>
+      </w:rPr>
+    </w:lvl>
+    <w:lvl w:ilvl="8" w:tentative="1">
+      <w:start w:val="1"/>
+      <w:numFmt w:val="bullet"/>
+      <w:lvlText w:val=""/>
+      <w:lvlJc w:val="left"/>
+      <w:pPr>
+        <w:tabs>
+          <w:tab w:val="num" w:pos="6480"/>
+        </w:tabs>
+        <w:ind w:left="6480" w:hanging="360"/>
+      </w:pPr>
+      <w:rPr>
+        <w:rFonts w:ascii="Wingdings" w:hAnsi="Wingdings" w:hint="default"/>
+        <w:sz w:val="20"/>
+      </w:rPr>
+    </w:lvl>
+  </w:abstractNum>
+  <w:abstractNum w:abstractNumId="25" w15:restartNumberingAfterBreak="0">
     <w:nsid w:val="6F5F55BC"/>
     <w:multiLevelType w:val="multilevel"/>
     <w:tmpl w:val="A7C49CAE"/>
@@ -5284,7 +7693,7 @@
       </w:rPr>
     </w:lvl>
   </w:abstractNum>
-  <w:abstractNum w:abstractNumId="17" w15:restartNumberingAfterBreak="0">
+  <w:abstractNum w:abstractNumId="26" w15:restartNumberingAfterBreak="0">
     <w:nsid w:val="778744BE"/>
     <w:multiLevelType w:val="multilevel"/>
     <w:tmpl w:val="D736D474"/>
@@ -5433,7 +7842,7 @@
       </w:rPr>
     </w:lvl>
   </w:abstractNum>
-  <w:abstractNum w:abstractNumId="18" w15:restartNumberingAfterBreak="0">
+  <w:abstractNum w:abstractNumId="27" w15:restartNumberingAfterBreak="0">
     <w:nsid w:val="786C1930"/>
     <w:multiLevelType w:val="multilevel"/>
     <w:tmpl w:val="12326BB2"/>
@@ -5583,61 +7992,88 @@
     </w:lvl>
   </w:abstractNum>
   <w:num w:numId="1" w16cid:durableId="1946109771">
+    <w:abstractNumId w:val="27"/>
+  </w:num>
+  <w:num w:numId="2" w16cid:durableId="410007491">
+    <w:abstractNumId w:val="15"/>
+  </w:num>
+  <w:num w:numId="3" w16cid:durableId="552809295">
+    <w:abstractNumId w:val="22"/>
+  </w:num>
+  <w:num w:numId="4" w16cid:durableId="102002037">
+    <w:abstractNumId w:val="4"/>
+  </w:num>
+  <w:num w:numId="5" w16cid:durableId="596986800">
+    <w:abstractNumId w:val="25"/>
+  </w:num>
+  <w:num w:numId="6" w16cid:durableId="1399404169">
+    <w:abstractNumId w:val="21"/>
+  </w:num>
+  <w:num w:numId="7" w16cid:durableId="1916740527">
+    <w:abstractNumId w:val="19"/>
+  </w:num>
+  <w:num w:numId="8" w16cid:durableId="1627082355">
+    <w:abstractNumId w:val="10"/>
+  </w:num>
+  <w:num w:numId="9" w16cid:durableId="221138189">
     <w:abstractNumId w:val="18"/>
   </w:num>
-  <w:num w:numId="2" w16cid:durableId="410007491">
+  <w:num w:numId="10" w16cid:durableId="890381292">
+    <w:abstractNumId w:val="9"/>
+  </w:num>
+  <w:num w:numId="11" w16cid:durableId="2024503817">
+    <w:abstractNumId w:val="17"/>
+  </w:num>
+  <w:num w:numId="12" w16cid:durableId="151600545">
+    <w:abstractNumId w:val="26"/>
+  </w:num>
+  <w:num w:numId="13" w16cid:durableId="1289900214">
+    <w:abstractNumId w:val="5"/>
+  </w:num>
+  <w:num w:numId="14" w16cid:durableId="440611188">
+    <w:abstractNumId w:val="6"/>
+  </w:num>
+  <w:num w:numId="15" w16cid:durableId="149446953">
+    <w:abstractNumId w:val="23"/>
+  </w:num>
+  <w:num w:numId="16" w16cid:durableId="1891723889">
     <w:abstractNumId w:val="8"/>
   </w:num>
-  <w:num w:numId="3" w16cid:durableId="552809295">
+  <w:num w:numId="17" w16cid:durableId="41832480">
+    <w:abstractNumId w:val="12"/>
+  </w:num>
+  <w:num w:numId="18" w16cid:durableId="182206126">
+    <w:abstractNumId w:val="7"/>
+  </w:num>
+  <w:num w:numId="19" w16cid:durableId="772436746">
+    <w:abstractNumId w:val="20"/>
+  </w:num>
+  <w:num w:numId="20" w16cid:durableId="697856530">
+    <w:abstractNumId w:val="13"/>
+  </w:num>
+  <w:num w:numId="21" w16cid:durableId="555239496">
+    <w:abstractNumId w:val="24"/>
+  </w:num>
+  <w:num w:numId="22" w16cid:durableId="1716153961">
+    <w:abstractNumId w:val="11"/>
+  </w:num>
+  <w:num w:numId="23" w16cid:durableId="1464075741">
+    <w:abstractNumId w:val="3"/>
+  </w:num>
+  <w:num w:numId="24" w16cid:durableId="2077703158">
+    <w:abstractNumId w:val="2"/>
+  </w:num>
+  <w:num w:numId="25" w16cid:durableId="256134868">
+    <w:abstractNumId w:val="0"/>
+  </w:num>
+  <w:num w:numId="26" w16cid:durableId="2122987919">
+    <w:abstractNumId w:val="16"/>
+  </w:num>
+  <w:num w:numId="27" w16cid:durableId="835464321">
     <w:abstractNumId w:val="14"/>
   </w:num>
-  <w:num w:numId="4" w16cid:durableId="102002037">
-    <w:abstractNumId w:val="0"/>
-  </w:num>
-  <w:num w:numId="5" w16cid:durableId="596986800">
-    <w:abstractNumId w:val="16"/>
-  </w:num>
-  <w:num w:numId="6" w16cid:durableId="1399404169">
-    <w:abstractNumId w:val="13"/>
-  </w:num>
-  <w:num w:numId="7" w16cid:durableId="1916740527">
-    <w:abstractNumId w:val="11"/>
-  </w:num>
-  <w:num w:numId="8" w16cid:durableId="1627082355">
-    <w:abstractNumId w:val="6"/>
-  </w:num>
-  <w:num w:numId="9" w16cid:durableId="221138189">
-    <w:abstractNumId w:val="10"/>
-  </w:num>
-  <w:num w:numId="10" w16cid:durableId="890381292">
-    <w:abstractNumId w:val="5"/>
-  </w:num>
-  <w:num w:numId="11" w16cid:durableId="2024503817">
-    <w:abstractNumId w:val="9"/>
-  </w:num>
-  <w:num w:numId="12" w16cid:durableId="151600545">
-    <w:abstractNumId w:val="17"/>
-  </w:num>
-  <w:num w:numId="13" w16cid:durableId="1289900214">
+  <w:num w:numId="28" w16cid:durableId="2056000180">
     <w:abstractNumId w:val="1"/>
-  </w:num>
-  <w:num w:numId="14" w16cid:durableId="440611188">
-    <w:abstractNumId w:val="2"/>
-  </w:num>
-  <w:num w:numId="15" w16cid:durableId="149446953">
-    <w:abstractNumId w:val="15"/>
-  </w:num>
-  <w:num w:numId="16" w16cid:durableId="1891723889">
-    <w:abstractNumId w:val="4"/>
-  </w:num>
-  <w:num w:numId="17" w16cid:durableId="41832480">
-    <w:abstractNumId w:val="7"/>
-  </w:num>
-  <w:num w:numId="18" w16cid:durableId="182206126">
-    <w:abstractNumId w:val="3"/>
-  </w:num>
-  <w:num w:numId="19" w16cid:durableId="772436746">
-    <w:abstractNumId w:val="12"/>
   </w:num>
 </w:numbering>
 </file>

</xml_diff>